<commit_message>
feat: implemented RAG AI chatbot, updated knowledge base, and refined UI
- Architected a two-stage Retrieval-Augmented Generation pipeline using Groq LLaMA 3.1 8B in src/app/api/chat/route.ts.

- Integrated Supabase PostgreSQL with Prisma to fetch KnowledgeChunk records and store real-time encrypted ChatMessage and LlmLog analytics.

- Synced the RAG index and src/content/profile.ts with updated resume bullets for Shipt and ACU.

- Replaced public/Girwan-Dhakal-Resume.docx with the newly updated docs/Girwan Dhakal.docx master file.

- Added eye-blinking animations to phone-messenger.tsx and copyright footer to the homepage.

- Excluded .agents, docs/prompts, and docs/specs from tracking via .gitignore.

- Created comprehensive documentation in docs/project-overview.md.
</commit_message>
<xml_diff>
--- a/docs/Girwan Dhakal.docx
+++ b/docs/Girwan Dhakal.docx
@@ -127,6 +127,7 @@
         </w:rPr>
         <w:t>/</w:t>
       </w:r>
+      <w:proofErr w:type="spellStart"/>
       <w:r>
         <w:rPr>
           <w:color w:val="343434"/>
@@ -143,6 +144,7 @@
         </w:rPr>
         <w:t>l</w:t>
       </w:r>
+      <w:proofErr w:type="spellEnd"/>
       <w:r>
         <w:rPr>
           <w:color w:val="0A0A0A"/>
@@ -188,6 +190,7 @@
         </w:rPr>
         <w:t>/</w:t>
       </w:r>
+      <w:proofErr w:type="spellStart"/>
       <w:r>
         <w:rPr>
           <w:color w:val="343434"/>
@@ -224,6 +227,7 @@
         </w:rPr>
         <w:t>l</w:t>
       </w:r>
+      <w:proofErr w:type="spellEnd"/>
       <w:r>
         <w:rPr>
           <w:color w:val="0A0A0A"/>
@@ -336,7 +340,7 @@
           </mc:Choice>
           <mc:Fallback>
             <w:pict>
-              <v:shape w14:anchorId="4E899ED3" id="Graphic 4" o:spid="_x0000_s1026" style="position:absolute;margin-left:42.05pt;margin-top:3.7pt;width:529.85pt;height:.1pt;z-index:15731712;visibility:visible;mso-wrap-style:square;mso-wrap-distance-left:0;mso-wrap-distance-top:0;mso-wrap-distance-right:0;mso-wrap-distance-bottom:0;mso-position-horizontal:absolute;mso-position-horizontal-relative:page;mso-position-vertical:absolute;mso-position-vertical-relative:text;v-text-anchor:top" coordsize="6729095,1270" o:gfxdata="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" path="m,l6728650,e" filled="f" strokeweight=".25453mm">
+              <v:shape w14:anchorId="0B47183A" id="Graphic 4" o:spid="_x0000_s1026" style="position:absolute;margin-left:42.05pt;margin-top:3.7pt;width:529.85pt;height:.1pt;z-index:15731712;visibility:visible;mso-wrap-style:square;mso-wrap-distance-left:0;mso-wrap-distance-top:0;mso-wrap-distance-right:0;mso-wrap-distance-bottom:0;mso-position-horizontal:absolute;mso-position-horizontal-relative:page;mso-position-vertical:absolute;mso-position-vertical-relative:text;v-text-anchor:top" coordsize="6729095,1270" o:gfxdata="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" path="m,l6728650,e" filled="f" strokeweight=".25453mm">
                 <v:path arrowok="t"/>
                 <w10:wrap anchorx="page"/>
               </v:shape>
@@ -924,7 +928,7 @@
           </mc:Choice>
           <mc:Fallback>
             <w:pict>
-              <v:shape w14:anchorId="52118CF7" id="Graphic 5" o:spid="_x0000_s1026" style="position:absolute;margin-left:42.05pt;margin-top:3.5pt;width:529.85pt;height:.1pt;z-index:-15727104;visibility:visible;mso-wrap-style:square;mso-wrap-distance-left:0;mso-wrap-distance-top:0;mso-wrap-distance-right:0;mso-wrap-distance-bottom:0;mso-position-horizontal:absolute;mso-position-horizontal-relative:page;mso-position-vertical:absolute;mso-position-vertical-relative:text;v-text-anchor:top" coordsize="6729095,1270" o:gfxdata="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" path="m,l6728650,e" filled="f" strokeweight=".25453mm">
+              <v:shape w14:anchorId="1956D560" id="Graphic 5" o:spid="_x0000_s1026" style="position:absolute;margin-left:42.05pt;margin-top:3.5pt;width:529.85pt;height:.1pt;z-index:-15727104;visibility:visible;mso-wrap-style:square;mso-wrap-distance-left:0;mso-wrap-distance-top:0;mso-wrap-distance-right:0;mso-wrap-distance-bottom:0;mso-position-horizontal:absolute;mso-position-horizontal-relative:page;mso-position-vertical:absolute;mso-position-vertical-relative:text;v-text-anchor:top" coordsize="6729095,1270" o:gfxdata="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" path="m,l6728650,e" filled="f" strokeweight=".25453mm">
                 <v:path arrowok="t"/>
                 <w10:wrap type="topAndBottom" anchorx="page"/>
               </v:shape>
@@ -946,7 +950,7 @@
           <w:b/>
           <w:color w:val="0A0A0A"/>
         </w:rPr>
-        <w:t>Incoming Data Science Intern</w:t>
+        <w:t>Data Science Intern</w:t>
       </w:r>
       <w:r>
         <w:rPr>
@@ -1023,6 +1027,7 @@
           <w:sz w:val="21"/>
         </w:rPr>
       </w:pPr>
+      <w:proofErr w:type="spellStart"/>
       <w:r>
         <w:rPr>
           <w:i/>
@@ -1031,6 +1036,7 @@
         </w:rPr>
         <w:t>Shipt</w:t>
       </w:r>
+      <w:proofErr w:type="spellEnd"/>
       <w:r>
         <w:rPr>
           <w:i/>
@@ -1083,22 +1089,42 @@
         </w:numPr>
       </w:pPr>
       <w:r>
-        <w:t>P</w:t>
-      </w:r>
-      <w:r>
-        <w:t xml:space="preserve">artnering with business teams to define analytical questions, conduct exploratory analysis, build statistical and predictive models on large </w:t>
-      </w:r>
-      <w:r>
-        <w:t>datasets</w:t>
-      </w:r>
-      <w:r>
-        <w:t xml:space="preserve"> and </w:t>
-      </w:r>
-      <w:r>
-        <w:t>design, analyze, and communicate experiment results</w:t>
-      </w:r>
-      <w:r>
-        <w:t>.</w:t>
+        <w:t xml:space="preserve">Cut Slack-based data requests by </w:t>
+      </w:r>
+      <w:r>
+        <w:rPr>
+          <w:b/>
+          <w:bCs/>
+        </w:rPr>
+        <w:t>75%</w:t>
+      </w:r>
+      <w:r>
+        <w:t xml:space="preserve"> by developing a Snowflake Cortex NLP-to-SQL agent and deploying a Next.js/D3.js self-service analytics dashboard on Snowflake Container Services.</w:t>
+      </w:r>
+    </w:p>
+    <w:p>
+      <w:pPr>
+        <w:pStyle w:val="ListParagraph"/>
+        <w:numPr>
+          <w:ilvl w:val="0"/>
+          <w:numId w:val="3"/>
+        </w:numPr>
+      </w:pPr>
+      <w:r>
+        <w:t xml:space="preserve">Reduced data science/AI project setup time by </w:t>
+      </w:r>
+      <w:r>
+        <w:rPr>
+          <w:b/>
+          <w:bCs/>
+        </w:rPr>
+        <w:t>50%</w:t>
+      </w:r>
+      <w:r>
+        <w:t xml:space="preserve"> by creating a reusable template with CI/CD integration, agentic automation, and prebuilt config and Docker scaffolding.</w:t>
+      </w:r>
+      <w:r>
+        <w:t xml:space="preserve"> </w:t>
       </w:r>
     </w:p>
     <w:p>
@@ -1528,16 +1554,10 @@
         <w:t xml:space="preserve"> </w:t>
       </w:r>
       <w:r>
-        <w:t>finance</w:t>
-      </w:r>
-      <w:r>
-        <w:rPr>
-          <w:spacing w:val="40"/>
-        </w:rPr>
-        <w:t xml:space="preserve"> </w:t>
-      </w:r>
-      <w:r>
         <w:t>team</w:t>
+      </w:r>
+      <w:r>
+        <w:t>s</w:t>
       </w:r>
       <w:r>
         <w:rPr>
@@ -1623,6 +1643,10 @@
           <w:ilvl w:val="0"/>
           <w:numId w:val="11"/>
         </w:numPr>
+        <w:rPr>
+          <w:i/>
+          <w:sz w:val="21"/>
+        </w:rPr>
       </w:pPr>
       <w:r>
         <w:t>Created</w:t>
@@ -1661,7 +1685,10 @@
         <w:t xml:space="preserve"> </w:t>
       </w:r>
       <w:r>
-        <w:t>increasing</w:t>
+        <w:t>increas</w:t>
+      </w:r>
+      <w:r>
+        <w:t>ed</w:t>
       </w:r>
       <w:r>
         <w:rPr>
@@ -1682,16 +1709,7 @@
         <w:t xml:space="preserve">sage </w:t>
       </w:r>
       <w:r>
-        <w:t>of</w:t>
-      </w:r>
-      <w:r>
-        <w:rPr>
-          <w:spacing w:val="25"/>
-        </w:rPr>
-        <w:t xml:space="preserve"> </w:t>
-      </w:r>
-      <w:r>
-        <w:t>dashboards</w:t>
+        <w:t>of dashboards</w:t>
       </w:r>
       <w:r>
         <w:rPr>
@@ -1747,22 +1765,13 @@
         <w:t xml:space="preserve"> </w:t>
       </w:r>
       <w:r>
-        <w:t>and</w:t>
-      </w:r>
-      <w:r>
-        <w:rPr>
-          <w:spacing w:val="25"/>
-        </w:rPr>
-        <w:t xml:space="preserve"> </w:t>
-      </w:r>
-      <w:r>
-        <w:t>running</w:t>
-      </w:r>
-      <w:r>
-        <w:rPr>
-          <w:spacing w:val="27"/>
-        </w:rPr>
-        <w:t xml:space="preserve"> </w:t>
+        <w:t xml:space="preserve">and </w:t>
+      </w:r>
+      <w:r>
+        <w:t xml:space="preserve">ran </w:t>
+      </w:r>
+      <w:r>
+        <w:t xml:space="preserve">weekly </w:t>
       </w:r>
       <w:r>
         <w:rPr>
@@ -1814,10 +1823,6 @@
           <w:ilvl w:val="0"/>
           <w:numId w:val="11"/>
         </w:numPr>
-        <w:rPr>
-          <w:b/>
-          <w:bCs/>
-        </w:rPr>
       </w:pPr>
       <w:r>
         <w:t>Optimiz</w:t>
@@ -1832,10 +1837,7 @@
         <w:t>d</w:t>
       </w:r>
       <w:r>
-        <w:rPr>
-          <w:spacing w:val="33"/>
-        </w:rPr>
-        <w:t xml:space="preserve"> </w:t>
+        <w:t xml:space="preserve"> SQL </w:t>
       </w:r>
       <w:r>
         <w:t>data</w:t>
@@ -1906,16 +1908,7 @@
         <w:t xml:space="preserve"> </w:t>
       </w:r>
       <w:r>
-        <w:t>update</w:t>
-      </w:r>
-      <w:r>
-        <w:rPr>
-          <w:spacing w:val="33"/>
-        </w:rPr>
-        <w:t xml:space="preserve"> </w:t>
-      </w:r>
-      <w:r>
-        <w:t>time</w:t>
+        <w:t>update time</w:t>
       </w:r>
       <w:r>
         <w:rPr>
@@ -1938,7 +1931,35 @@
           <w:bCs/>
           <w:spacing w:val="-4"/>
         </w:rPr>
-        <w:t>30%.</w:t>
+        <w:t>30%</w:t>
+      </w:r>
+      <w:r>
+        <w:rPr>
+          <w:b/>
+          <w:bCs/>
+          <w:spacing w:val="-4"/>
+        </w:rPr>
+        <w:t xml:space="preserve"> </w:t>
+      </w:r>
+      <w:r>
+        <w:rPr>
+          <w:spacing w:val="-4"/>
+        </w:rPr>
+        <w:t xml:space="preserve">and ensuring up-to-date </w:t>
+      </w:r>
+      <w:r>
+        <w:rPr>
+          <w:spacing w:val="-4"/>
+        </w:rPr>
+        <w:t>tables at the start of each business day</w:t>
+      </w:r>
+      <w:r>
+        <w:rPr>
+          <w:b/>
+          <w:bCs/>
+          <w:spacing w:val="-4"/>
+        </w:rPr>
+        <w:t>.</w:t>
       </w:r>
     </w:p>
     <w:p>
@@ -2488,13 +2509,49 @@
         </w:numPr>
       </w:pPr>
       <w:r>
-        <w:t>Used UA-HPC to submit and manage SLURM jobs, run multiprocessing workflows</w:t>
+        <w:t xml:space="preserve">Wrote </w:t>
+      </w:r>
+      <w:r>
+        <w:rPr>
+          <w:b/>
+          <w:bCs/>
+        </w:rPr>
+        <w:t>10+</w:t>
+      </w:r>
+      <w:r>
+        <w:t xml:space="preserve"> SLURM jobs for machine learning training</w:t>
+      </w:r>
+      <w:r>
+        <w:t xml:space="preserve"> and inference workflows</w:t>
+      </w:r>
+      <w:r>
+        <w:t xml:space="preserve">, reducing manual execution time by </w:t>
+      </w:r>
+      <w:r>
+        <w:rPr>
+          <w:b/>
+          <w:bCs/>
+        </w:rPr>
+        <w:t>90</w:t>
+      </w:r>
+      <w:r>
+        <w:rPr>
+          <w:b/>
+          <w:bCs/>
+        </w:rPr>
+        <w:t>%</w:t>
+      </w:r>
+      <w:r>
+        <w:t xml:space="preserve"> and enabling scalable computation</w:t>
+      </w:r>
+      <w:r>
+        <w:t xml:space="preserve"> on High-Performance Computer</w:t>
+      </w:r>
+      <w:r>
+        <w:t>s</w:t>
       </w:r>
       <w:r>
         <w:t>.</w:t>
-      </w:r>
-      <w:r>
-        <w:t xml:space="preserve"> </w:t>
       </w:r>
     </w:p>
     <w:p>
@@ -2530,10 +2587,10 @@
         <w:rPr>
           <w:spacing w:val="29"/>
         </w:rPr>
-        <w:t xml:space="preserve"> </w:t>
-      </w:r>
-      <w:r>
-        <w:t>preprocessing</w:t>
+        <w:t>-</w:t>
+      </w:r>
+      <w:r>
+        <w:t>engineering</w:t>
       </w:r>
       <w:r>
         <w:rPr>
@@ -2819,221 +2876,6 @@
         </w:rPr>
         <w:t>.</w:t>
       </w:r>
-    </w:p>
-    <w:p>
-      <w:pPr>
-        <w:pStyle w:val="ListParagraph"/>
-        <w:numPr>
-          <w:ilvl w:val="0"/>
-          <w:numId w:val="4"/>
-        </w:numPr>
-      </w:pPr>
-      <w:r>
-        <w:rPr>
-          <w:w w:val="110"/>
-        </w:rPr>
-        <w:t>Contribut</w:t>
-      </w:r>
-      <w:r>
-        <w:rPr>
-          <w:color w:val="494949"/>
-          <w:w w:val="110"/>
-        </w:rPr>
-        <w:t>e</w:t>
-      </w:r>
-      <w:r>
-        <w:rPr>
-          <w:w w:val="110"/>
-        </w:rPr>
-        <w:t>d to grant proposals by providing</w:t>
-      </w:r>
-      <w:r>
-        <w:rPr>
-          <w:spacing w:val="-4"/>
-          <w:w w:val="110"/>
-        </w:rPr>
-        <w:t xml:space="preserve"> </w:t>
-      </w:r>
-      <w:r>
-        <w:rPr>
-          <w:color w:val="343434"/>
-          <w:w w:val="110"/>
-        </w:rPr>
-        <w:t>statistica</w:t>
-      </w:r>
-      <w:r>
-        <w:rPr>
-          <w:color w:val="0A0A0A"/>
-          <w:w w:val="110"/>
-        </w:rPr>
-        <w:t>l</w:t>
-      </w:r>
-      <w:r>
-        <w:rPr>
-          <w:color w:val="0A0A0A"/>
-          <w:spacing w:val="-9"/>
-          <w:w w:val="110"/>
-        </w:rPr>
-        <w:t xml:space="preserve"> </w:t>
-      </w:r>
-      <w:r>
-        <w:rPr>
-          <w:color w:val="343434"/>
-          <w:w w:val="110"/>
-        </w:rPr>
-        <w:t>ana</w:t>
-      </w:r>
-      <w:r>
-        <w:rPr>
-          <w:color w:val="0A0A0A"/>
-          <w:w w:val="110"/>
-        </w:rPr>
-        <w:t>l</w:t>
-      </w:r>
-      <w:r>
-        <w:rPr>
-          <w:color w:val="343434"/>
-          <w:w w:val="110"/>
-        </w:rPr>
-        <w:t>ysis</w:t>
-      </w:r>
-      <w:r>
-        <w:rPr>
-          <w:color w:val="343434"/>
-          <w:spacing w:val="-3"/>
-          <w:w w:val="110"/>
-        </w:rPr>
-        <w:t xml:space="preserve"> </w:t>
-      </w:r>
-      <w:r>
-        <w:rPr>
-          <w:color w:val="343434"/>
-          <w:w w:val="110"/>
-        </w:rPr>
-        <w:t>a</w:t>
-      </w:r>
-      <w:r>
-        <w:rPr>
-          <w:color w:val="0A0A0A"/>
-          <w:w w:val="110"/>
-        </w:rPr>
-        <w:t>nd proof-of-con</w:t>
-      </w:r>
-      <w:r>
-        <w:rPr>
-          <w:color w:val="343434"/>
-          <w:w w:val="110"/>
-        </w:rPr>
-        <w:t>cept</w:t>
-      </w:r>
-      <w:r>
-        <w:rPr>
-          <w:color w:val="343434"/>
-          <w:spacing w:val="15"/>
-          <w:w w:val="110"/>
-        </w:rPr>
-        <w:t xml:space="preserve"> </w:t>
-      </w:r>
-      <w:r>
-        <w:rPr>
-          <w:color w:val="0A0A0A"/>
-          <w:w w:val="110"/>
-        </w:rPr>
-        <w:t>r</w:t>
-      </w:r>
-      <w:r>
-        <w:rPr>
-          <w:color w:val="494949"/>
-          <w:w w:val="110"/>
-        </w:rPr>
-        <w:t>es</w:t>
-      </w:r>
-      <w:r>
-        <w:rPr>
-          <w:w w:val="110"/>
-        </w:rPr>
-        <w:t>ults</w:t>
-      </w:r>
-      <w:r>
-        <w:rPr>
-          <w:spacing w:val="-3"/>
-          <w:w w:val="110"/>
-        </w:rPr>
-        <w:t xml:space="preserve"> </w:t>
-      </w:r>
-      <w:r>
-        <w:rPr>
-          <w:w w:val="110"/>
-        </w:rPr>
-        <w:t xml:space="preserve">that demonstrate </w:t>
-      </w:r>
-      <w:r>
-        <w:rPr>
-          <w:color w:val="0A0A0A"/>
-          <w:w w:val="110"/>
-        </w:rPr>
-        <w:t>proj</w:t>
-      </w:r>
-      <w:r>
-        <w:rPr>
-          <w:color w:val="343434"/>
-          <w:w w:val="110"/>
-        </w:rPr>
-        <w:t>ect</w:t>
-      </w:r>
-      <w:r>
-        <w:rPr>
-          <w:color w:val="343434"/>
-          <w:spacing w:val="31"/>
-          <w:w w:val="110"/>
-        </w:rPr>
-        <w:t xml:space="preserve"> </w:t>
-      </w:r>
-      <w:r>
-        <w:rPr>
-          <w:color w:val="343434"/>
-          <w:w w:val="110"/>
-        </w:rPr>
-        <w:t>feas</w:t>
-      </w:r>
-      <w:r>
-        <w:rPr>
-          <w:color w:val="0A0A0A"/>
-          <w:w w:val="110"/>
-        </w:rPr>
-        <w:t>ibilit</w:t>
-      </w:r>
-      <w:r>
-        <w:rPr>
-          <w:color w:val="343434"/>
-          <w:w w:val="110"/>
-        </w:rPr>
-        <w:t xml:space="preserve">y </w:t>
-      </w:r>
-      <w:r>
-        <w:rPr>
-          <w:w w:val="110"/>
-        </w:rPr>
-        <w:t xml:space="preserve">to funding </w:t>
-      </w:r>
-      <w:r>
-        <w:rPr>
-          <w:color w:val="343434"/>
-          <w:w w:val="110"/>
-        </w:rPr>
-        <w:t>agencies.</w:t>
-      </w:r>
-    </w:p>
-    <w:p>
-      <w:pPr>
-        <w:pStyle w:val="BodyText"/>
-        <w:ind w:left="127"/>
-        <w:rPr>
-          <w:color w:val="1F1F1F"/>
-          <w:spacing w:val="-2"/>
-          <w:w w:val="110"/>
-        </w:rPr>
-      </w:pPr>
     </w:p>
     <w:p>
       <w:pPr>
@@ -3111,7 +2953,7 @@
           </mc:Choice>
           <mc:Fallback>
             <w:pict>
-              <v:shape w14:anchorId="3A8DD1F4" id="Graphic 6" o:spid="_x0000_s1026" style="position:absolute;margin-left:42.05pt;margin-top:14.65pt;width:529.85pt;height:.1pt;z-index:-15726592;visibility:visible;mso-wrap-style:square;mso-wrap-distance-left:0;mso-wrap-distance-top:0;mso-wrap-distance-right:0;mso-wrap-distance-bottom:0;mso-position-horizontal:absolute;mso-position-horizontal-relative:page;mso-position-vertical:absolute;mso-position-vertical-relative:text;v-text-anchor:top" coordsize="6729095,1270" o:gfxdata="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" path="m,l6728650,e" filled="f" strokeweight=".25453mm">
+              <v:shape w14:anchorId="58B1DA4C" id="Graphic 6" o:spid="_x0000_s1026" style="position:absolute;margin-left:42.05pt;margin-top:14.65pt;width:529.85pt;height:.1pt;z-index:-15726592;visibility:visible;mso-wrap-style:square;mso-wrap-distance-left:0;mso-wrap-distance-top:0;mso-wrap-distance-right:0;mso-wrap-distance-bottom:0;mso-position-horizontal:absolute;mso-position-horizontal-relative:page;mso-position-vertical:absolute;mso-position-vertical-relative:text;v-text-anchor:top" coordsize="6729095,1270" o:gfxdata="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" path="m,l6728650,e" filled="f" strokeweight=".25453mm">
                 <v:path arrowok="t"/>
                 <w10:wrap type="topAndBottom" anchorx="page"/>
               </v:shape>
@@ -3287,6 +3129,7 @@
         <w:t xml:space="preserve">| </w:t>
       </w:r>
       <w:hyperlink r:id="rId8" w:history="1">
+        <w:proofErr w:type="spellStart"/>
         <w:r>
           <w:rPr>
             <w:rStyle w:val="Hyperlink"/>
@@ -3294,6 +3137,7 @@
           </w:rPr>
           <w:t>Github</w:t>
         </w:r>
+        <w:proofErr w:type="spellEnd"/>
       </w:hyperlink>
     </w:p>
     <w:p>
@@ -3341,6 +3185,7 @@
         </w:rPr>
         <w:t xml:space="preserve"> | </w:t>
       </w:r>
+      <w:proofErr w:type="spellStart"/>
       <w:r>
         <w:rPr>
           <w:rStyle w:val="ProjectSkillsChar"/>
@@ -3349,19 +3194,31 @@
           <w:i/>
           <w:iCs/>
         </w:rPr>
-        <w:t>Streamlit, Python, Scikit-learn, OpenAI, Plotly, Pandas</w:t>
-      </w:r>
-      <w:r>
-        <w:rPr>
+        <w:t>Streamlit</w:t>
+      </w:r>
+      <w:proofErr w:type="spellEnd"/>
+      <w:r>
+        <w:rPr>
+          <w:rStyle w:val="ProjectSkillsChar"/>
+          <w:b w:val="0"/>
+          <w:bCs w:val="0"/>
           <w:i/>
           <w:iCs/>
         </w:rPr>
+        <w:t>, Python, Scikit-learn, OpenAI, Plotly, Pandas</w:t>
+      </w:r>
+      <w:r>
+        <w:rPr>
+          <w:i/>
+          <w:iCs/>
+        </w:rPr>
         <w:t xml:space="preserve"> </w:t>
       </w:r>
       <w:r>
         <w:t xml:space="preserve">| </w:t>
       </w:r>
       <w:hyperlink r:id="rId9" w:history="1">
+        <w:proofErr w:type="spellStart"/>
         <w:r>
           <w:rPr>
             <w:rStyle w:val="Hyperlink"/>
@@ -3370,6 +3227,7 @@
           </w:rPr>
           <w:t>Github</w:t>
         </w:r>
+        <w:proofErr w:type="spellEnd"/>
       </w:hyperlink>
     </w:p>
     <w:p>
@@ -3377,7 +3235,15 @@
         <w:pStyle w:val="ListParagraph"/>
       </w:pPr>
       <w:r>
-        <w:t xml:space="preserve">Architected a scalable enterprise analytics platform utilizing Python and Streamlit to centralize </w:t>
+        <w:t xml:space="preserve">Architected a scalable enterprise analytics platform utilizing Python and </w:t>
+      </w:r>
+      <w:proofErr w:type="spellStart"/>
+      <w:r>
+        <w:t>Streamlit</w:t>
+      </w:r>
+      <w:proofErr w:type="spellEnd"/>
+      <w:r>
+        <w:t xml:space="preserve"> to centralize </w:t>
       </w:r>
       <w:r>
         <w:t>network infrastructure</w:t>
@@ -3564,7 +3430,7 @@
           </mc:Choice>
           <mc:Fallback>
             <w:pict>
-              <v:shape w14:anchorId="55A3E24F" id="Graphic 8" o:spid="_x0000_s1026" style="position:absolute;margin-left:42.05pt;margin-top:14.4pt;width:529.85pt;height:.1pt;z-index:-15726080;visibility:visible;mso-wrap-style:square;mso-wrap-distance-left:0;mso-wrap-distance-top:0;mso-wrap-distance-right:0;mso-wrap-distance-bottom:0;mso-position-horizontal:absolute;mso-position-horizontal-relative:page;mso-position-vertical:absolute;mso-position-vertical-relative:text;v-text-anchor:top" coordsize="6729095,1270" o:gfxdata="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" path="m,l6728650,e" filled="f" strokeweight=".25453mm">
+              <v:shape w14:anchorId="5A72E1DE" id="Graphic 8" o:spid="_x0000_s1026" style="position:absolute;margin-left:42.05pt;margin-top:14.4pt;width:529.85pt;height:.1pt;z-index:-15726080;visibility:visible;mso-wrap-style:square;mso-wrap-distance-left:0;mso-wrap-distance-top:0;mso-wrap-distance-right:0;mso-wrap-distance-bottom:0;mso-position-horizontal:absolute;mso-position-horizontal-relative:page;mso-position-vertical:absolute;mso-position-vertical-relative:text;v-text-anchor:top" coordsize="6729095,1270" o:gfxdata="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" path="m,l6728650,e" filled="f" strokeweight=".25453mm">
                 <v:path arrowok="t"/>
                 <w10:wrap type="topAndBottom" anchorx="page"/>
               </v:shape>
@@ -4150,13 +4016,23 @@
         </w:rPr>
         <w:t xml:space="preserve"> </w:t>
       </w:r>
+      <w:proofErr w:type="spellStart"/>
       <w:r>
         <w:rPr>
           <w:color w:val="1F1F1F"/>
           <w:w w:val="105"/>
           <w:sz w:val="20"/>
         </w:rPr>
-        <w:t>PyTorch,</w:t>
+        <w:t>PyTorch</w:t>
+      </w:r>
+      <w:proofErr w:type="spellEnd"/>
+      <w:r>
+        <w:rPr>
+          <w:color w:val="1F1F1F"/>
+          <w:w w:val="105"/>
+          <w:sz w:val="20"/>
+        </w:rPr>
+        <w:t>,</w:t>
       </w:r>
       <w:r>
         <w:rPr>
@@ -4184,6 +4060,7 @@
         </w:rPr>
         <w:t xml:space="preserve"> </w:t>
       </w:r>
+      <w:proofErr w:type="spellStart"/>
       <w:r>
         <w:rPr>
           <w:color w:val="343434"/>
@@ -4193,6 +4070,7 @@
         </w:rPr>
         <w:t>Numpy</w:t>
       </w:r>
+      <w:proofErr w:type="spellEnd"/>
     </w:p>
     <w:sectPr>
       <w:type w:val="continuous"/>

</xml_diff>

<commit_message>
feat(portfolio): revamp UI, add AI project, and update profile for Agentic Engineering focus
- Refactored Contact section chat button with minimalist brutalist microanimations

- Removed global drop-shadow offsets for a cleaner aesthetic

- Added Personal AI Persona & RAG Chatbot to the Projects section with an interactive trigger

- Rewrote Hero and About Me sections to focus on AI, Data Science, and Agentic Engineering (Graduating May 2027)

- Replaced ALRI ML research bullet with new clinical joint-attention video detection tool

- Synced updated resume content with RAG knowledge base and fixed indexing script env loading

- Added support for remote Python Safety Microservice in Next.js API for Vercel deployment
</commit_message>
<xml_diff>
--- a/docs/Girwan Dhakal.docx
+++ b/docs/Girwan Dhakal.docx
@@ -127,7 +127,6 @@
         </w:rPr>
         <w:t>/</w:t>
       </w:r>
-      <w:proofErr w:type="spellStart"/>
       <w:r>
         <w:rPr>
           <w:color w:val="343434"/>
@@ -144,7 +143,6 @@
         </w:rPr>
         <w:t>l</w:t>
       </w:r>
-      <w:proofErr w:type="spellEnd"/>
       <w:r>
         <w:rPr>
           <w:color w:val="0A0A0A"/>
@@ -190,7 +188,6 @@
         </w:rPr>
         <w:t>/</w:t>
       </w:r>
-      <w:proofErr w:type="spellStart"/>
       <w:r>
         <w:rPr>
           <w:color w:val="343434"/>
@@ -227,7 +224,6 @@
         </w:rPr>
         <w:t>l</w:t>
       </w:r>
-      <w:proofErr w:type="spellEnd"/>
       <w:r>
         <w:rPr>
           <w:color w:val="0A0A0A"/>
@@ -340,7 +336,7 @@
           </mc:Choice>
           <mc:Fallback>
             <w:pict>
-              <v:shape w14:anchorId="0B47183A" id="Graphic 4" o:spid="_x0000_s1026" style="position:absolute;margin-left:42.05pt;margin-top:3.7pt;width:529.85pt;height:.1pt;z-index:15731712;visibility:visible;mso-wrap-style:square;mso-wrap-distance-left:0;mso-wrap-distance-top:0;mso-wrap-distance-right:0;mso-wrap-distance-bottom:0;mso-position-horizontal:absolute;mso-position-horizontal-relative:page;mso-position-vertical:absolute;mso-position-vertical-relative:text;v-text-anchor:top" coordsize="6729095,1270" o:gfxdata="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" path="m,l6728650,e" filled="f" strokeweight=".25453mm">
+              <v:shape w14:anchorId="131E32E0" id="Graphic 4" o:spid="_x0000_s1026" style="position:absolute;margin-left:42.05pt;margin-top:3.7pt;width:529.85pt;height:.1pt;z-index:15731712;visibility:visible;mso-wrap-style:square;mso-wrap-distance-left:0;mso-wrap-distance-top:0;mso-wrap-distance-right:0;mso-wrap-distance-bottom:0;mso-position-horizontal:absolute;mso-position-horizontal-relative:page;mso-position-vertical:absolute;mso-position-vertical-relative:text;v-text-anchor:top" coordsize="6729095,1270" o:gfxdata="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" path="m,l6728650,e" filled="f" strokeweight=".25453mm">
                 <v:path arrowok="t"/>
                 <w10:wrap anchorx="page"/>
               </v:shape>
@@ -928,7 +924,7 @@
           </mc:Choice>
           <mc:Fallback>
             <w:pict>
-              <v:shape w14:anchorId="1956D560" id="Graphic 5" o:spid="_x0000_s1026" style="position:absolute;margin-left:42.05pt;margin-top:3.5pt;width:529.85pt;height:.1pt;z-index:-15727104;visibility:visible;mso-wrap-style:square;mso-wrap-distance-left:0;mso-wrap-distance-top:0;mso-wrap-distance-right:0;mso-wrap-distance-bottom:0;mso-position-horizontal:absolute;mso-position-horizontal-relative:page;mso-position-vertical:absolute;mso-position-vertical-relative:text;v-text-anchor:top" coordsize="6729095,1270" o:gfxdata="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" path="m,l6728650,e" filled="f" strokeweight=".25453mm">
+              <v:shape w14:anchorId="2FBF26F6" id="Graphic 5" o:spid="_x0000_s1026" style="position:absolute;margin-left:42.05pt;margin-top:3.5pt;width:529.85pt;height:.1pt;z-index:-15727104;visibility:visible;mso-wrap-style:square;mso-wrap-distance-left:0;mso-wrap-distance-top:0;mso-wrap-distance-right:0;mso-wrap-distance-bottom:0;mso-position-horizontal:absolute;mso-position-horizontal-relative:page;mso-position-vertical:absolute;mso-position-vertical-relative:text;v-text-anchor:top" coordsize="6729095,1270" o:gfxdata="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" path="m,l6728650,e" filled="f" strokeweight=".25453mm">
                 <v:path arrowok="t"/>
                 <w10:wrap type="topAndBottom" anchorx="page"/>
               </v:shape>
@@ -1027,7 +1023,6 @@
           <w:sz w:val="21"/>
         </w:rPr>
       </w:pPr>
-      <w:proofErr w:type="spellStart"/>
       <w:r>
         <w:rPr>
           <w:i/>
@@ -1036,7 +1031,6 @@
         </w:rPr>
         <w:t>Shipt</w:t>
       </w:r>
-      <w:proofErr w:type="spellEnd"/>
       <w:r>
         <w:rPr>
           <w:i/>
@@ -1111,7 +1105,7 @@
         </w:numPr>
       </w:pPr>
       <w:r>
-        <w:t xml:space="preserve">Reduced data science/AI project setup time by </w:t>
+        <w:t xml:space="preserve">Designed a reusable ML project template with CI/CD integration, agentic automation, and prebuilt Docker/config scaffolding, reducing team setup time by </w:t>
       </w:r>
       <w:r>
         <w:rPr>
@@ -1121,844 +1115,6 @@
         <w:t>50%</w:t>
       </w:r>
       <w:r>
-        <w:t xml:space="preserve"> by creating a reusable template with CI/CD integration, agentic automation, and prebuilt config and Docker scaffolding.</w:t>
-      </w:r>
-      <w:r>
-        <w:t xml:space="preserve"> </w:t>
-      </w:r>
-    </w:p>
-    <w:p>
-      <w:pPr>
-        <w:tabs>
-          <w:tab w:val="left" w:pos="8994"/>
-        </w:tabs>
-        <w:spacing w:before="45" w:line="251" w:lineRule="exact"/>
-        <w:ind w:left="248"/>
-      </w:pPr>
-      <w:r>
-        <w:rPr>
-          <w:b/>
-          <w:color w:val="0A0A0A"/>
-          <w:w w:val="110"/>
-        </w:rPr>
-        <w:t>Data</w:t>
-      </w:r>
-      <w:r>
-        <w:rPr>
-          <w:b/>
-          <w:color w:val="0A0A0A"/>
-          <w:spacing w:val="62"/>
-          <w:w w:val="110"/>
-        </w:rPr>
-        <w:t xml:space="preserve"> </w:t>
-      </w:r>
-      <w:r>
-        <w:rPr>
-          <w:b/>
-          <w:color w:val="0A0A0A"/>
-          <w:w w:val="110"/>
-        </w:rPr>
-        <w:t>Analyst</w:t>
-      </w:r>
-      <w:r>
-        <w:rPr>
-          <w:b/>
-          <w:color w:val="0A0A0A"/>
-          <w:spacing w:val="20"/>
-          <w:w w:val="110"/>
-        </w:rPr>
-        <w:t xml:space="preserve"> </w:t>
-      </w:r>
-      <w:r>
-        <w:rPr>
-          <w:b/>
-          <w:color w:val="0A0A0A"/>
-          <w:w w:val="110"/>
-        </w:rPr>
-        <w:t>Co-</w:t>
-      </w:r>
-      <w:r>
-        <w:rPr>
-          <w:b/>
-          <w:color w:val="0A0A0A"/>
-          <w:spacing w:val="-5"/>
-          <w:w w:val="110"/>
-        </w:rPr>
-        <w:t>op</w:t>
-      </w:r>
-      <w:r>
-        <w:rPr>
-          <w:b/>
-          <w:color w:val="0A0A0A"/>
-        </w:rPr>
-        <w:tab/>
-      </w:r>
-      <w:r>
-        <w:rPr>
-          <w:color w:val="1F1F1F"/>
-          <w:w w:val="105"/>
-        </w:rPr>
-        <w:t>Aug</w:t>
-      </w:r>
-      <w:r>
-        <w:rPr>
-          <w:color w:val="1F1F1F"/>
-          <w:spacing w:val="11"/>
-          <w:w w:val="105"/>
-        </w:rPr>
-        <w:t xml:space="preserve"> </w:t>
-      </w:r>
-      <w:r>
-        <w:rPr>
-          <w:color w:val="1F1F1F"/>
-          <w:w w:val="105"/>
-        </w:rPr>
-        <w:t>2025</w:t>
-      </w:r>
-      <w:r>
-        <w:rPr>
-          <w:color w:val="1F1F1F"/>
-          <w:spacing w:val="-2"/>
-          <w:w w:val="105"/>
-        </w:rPr>
-        <w:t xml:space="preserve"> </w:t>
-      </w:r>
-      <w:r>
-        <w:rPr>
-          <w:color w:val="0A0A0A"/>
-          <w:w w:val="105"/>
-        </w:rPr>
-        <w:t>–</w:t>
-      </w:r>
-      <w:r>
-        <w:rPr>
-          <w:color w:val="0A0A0A"/>
-          <w:spacing w:val="11"/>
-          <w:w w:val="105"/>
-        </w:rPr>
-        <w:t xml:space="preserve"> </w:t>
-      </w:r>
-      <w:r>
-        <w:rPr>
-          <w:color w:val="1F1F1F"/>
-          <w:spacing w:val="-2"/>
-          <w:w w:val="105"/>
-        </w:rPr>
-        <w:t>May 2026</w:t>
-      </w:r>
-    </w:p>
-    <w:p>
-      <w:pPr>
-        <w:tabs>
-          <w:tab w:val="left" w:pos="9495"/>
-        </w:tabs>
-        <w:spacing w:line="240" w:lineRule="exact"/>
-        <w:ind w:left="266"/>
-        <w:rPr>
-          <w:i/>
-          <w:color w:val="1F1F1F"/>
-          <w:spacing w:val="-5"/>
-          <w:sz w:val="21"/>
-        </w:rPr>
-      </w:pPr>
-      <w:r>
-        <w:rPr>
-          <w:i/>
-          <w:color w:val="1F1F1F"/>
-          <w:sz w:val="21"/>
-        </w:rPr>
-        <w:t>Alabama</w:t>
-      </w:r>
-      <w:r>
-        <w:rPr>
-          <w:i/>
-          <w:color w:val="1F1F1F"/>
-          <w:spacing w:val="21"/>
-          <w:sz w:val="21"/>
-        </w:rPr>
-        <w:t xml:space="preserve"> </w:t>
-      </w:r>
-      <w:r>
-        <w:rPr>
-          <w:i/>
-          <w:color w:val="1F1F1F"/>
-          <w:sz w:val="21"/>
-        </w:rPr>
-        <w:t>Credit</w:t>
-      </w:r>
-      <w:r>
-        <w:rPr>
-          <w:i/>
-          <w:color w:val="1F1F1F"/>
-          <w:spacing w:val="23"/>
-          <w:sz w:val="21"/>
-        </w:rPr>
-        <w:t xml:space="preserve"> </w:t>
-      </w:r>
-      <w:r>
-        <w:rPr>
-          <w:i/>
-          <w:color w:val="1F1F1F"/>
-          <w:spacing w:val="-2"/>
-          <w:sz w:val="21"/>
-        </w:rPr>
-        <w:t>Union</w:t>
-      </w:r>
-      <w:r>
-        <w:rPr>
-          <w:i/>
-          <w:color w:val="1F1F1F"/>
-          <w:sz w:val="21"/>
-        </w:rPr>
-        <w:tab/>
-        <w:t>Tuscaloosa,</w:t>
-      </w:r>
-      <w:r>
-        <w:rPr>
-          <w:i/>
-          <w:color w:val="1F1F1F"/>
-          <w:spacing w:val="37"/>
-          <w:sz w:val="21"/>
-        </w:rPr>
-        <w:t xml:space="preserve"> </w:t>
-      </w:r>
-      <w:r>
-        <w:rPr>
-          <w:i/>
-          <w:color w:val="1F1F1F"/>
-          <w:spacing w:val="-5"/>
-          <w:sz w:val="21"/>
-        </w:rPr>
-        <w:t>AL</w:t>
-      </w:r>
-    </w:p>
-    <w:p>
-      <w:pPr>
-        <w:pStyle w:val="ListParagraph"/>
-        <w:numPr>
-          <w:ilvl w:val="0"/>
-          <w:numId w:val="11"/>
-        </w:numPr>
-        <w:rPr>
-          <w:i/>
-          <w:sz w:val="21"/>
-        </w:rPr>
-      </w:pPr>
-      <w:r>
-        <w:t>Built</w:t>
-      </w:r>
-      <w:r>
-        <w:rPr>
-          <w:spacing w:val="37"/>
-        </w:rPr>
-        <w:t xml:space="preserve"> </w:t>
-      </w:r>
-      <w:r>
-        <w:rPr>
-          <w:color w:val="343434"/>
-        </w:rPr>
-        <w:t>end</w:t>
-      </w:r>
-      <w:r>
-        <w:t>-to-</w:t>
-      </w:r>
-      <w:r>
-        <w:rPr>
-          <w:color w:val="343434"/>
-        </w:rPr>
-        <w:t>end</w:t>
-      </w:r>
-      <w:r>
-        <w:rPr>
-          <w:color w:val="343434"/>
-          <w:spacing w:val="33"/>
-        </w:rPr>
-        <w:t xml:space="preserve"> </w:t>
-      </w:r>
-      <w:r>
-        <w:rPr>
-          <w:color w:val="343434"/>
-        </w:rPr>
-        <w:t>automation</w:t>
-      </w:r>
-      <w:r>
-        <w:rPr>
-          <w:color w:val="343434"/>
-          <w:spacing w:val="27"/>
-        </w:rPr>
-        <w:t xml:space="preserve"> </w:t>
-      </w:r>
-      <w:r>
-        <w:rPr>
-          <w:color w:val="343434"/>
-        </w:rPr>
-        <w:t>so</w:t>
-      </w:r>
-      <w:r>
-        <w:t>lution</w:t>
-      </w:r>
-      <w:r>
-        <w:rPr>
-          <w:spacing w:val="40"/>
-        </w:rPr>
-        <w:t xml:space="preserve"> </w:t>
-      </w:r>
-      <w:r>
-        <w:t>using</w:t>
-      </w:r>
-      <w:r>
-        <w:rPr>
-          <w:spacing w:val="34"/>
-        </w:rPr>
-        <w:t xml:space="preserve"> </w:t>
-      </w:r>
-      <w:r>
-        <w:t>Microsoft</w:t>
-      </w:r>
-      <w:r>
-        <w:rPr>
-          <w:spacing w:val="40"/>
-        </w:rPr>
-        <w:t xml:space="preserve"> </w:t>
-      </w:r>
-      <w:r>
-        <w:t>Power</w:t>
-      </w:r>
-      <w:r>
-        <w:rPr>
-          <w:spacing w:val="40"/>
-        </w:rPr>
-        <w:t xml:space="preserve"> </w:t>
-      </w:r>
-      <w:r>
-        <w:t>Automate</w:t>
-      </w:r>
-      <w:r>
-        <w:rPr>
-          <w:spacing w:val="40"/>
-        </w:rPr>
-        <w:t xml:space="preserve"> </w:t>
-      </w:r>
-      <w:r>
-        <w:t>that</w:t>
-      </w:r>
-      <w:r>
-        <w:rPr>
-          <w:spacing w:val="34"/>
-        </w:rPr>
-        <w:t xml:space="preserve"> </w:t>
-      </w:r>
-      <w:r>
-        <w:rPr>
-          <w:b/>
-          <w:bCs/>
-          <w:color w:val="343434"/>
-        </w:rPr>
-        <w:t>e</w:t>
-      </w:r>
-      <w:r>
-        <w:rPr>
-          <w:b/>
-          <w:bCs/>
-        </w:rPr>
-        <w:t>limina</w:t>
-      </w:r>
-      <w:r>
-        <w:rPr>
-          <w:b/>
-          <w:bCs/>
-          <w:color w:val="343434"/>
-        </w:rPr>
-        <w:t>ted</w:t>
-      </w:r>
-      <w:r>
-        <w:rPr>
-          <w:color w:val="343434"/>
-          <w:spacing w:val="31"/>
-        </w:rPr>
-        <w:t xml:space="preserve"> </w:t>
-      </w:r>
-      <w:r>
-        <w:rPr>
-          <w:b/>
-          <w:bCs/>
-        </w:rPr>
-        <w:t xml:space="preserve">16 </w:t>
-      </w:r>
-      <w:r>
-        <w:rPr>
-          <w:b/>
-          <w:bCs/>
-        </w:rPr>
-        <w:t xml:space="preserve">monthly </w:t>
-      </w:r>
-      <w:r>
-        <w:rPr>
-          <w:b/>
-          <w:bCs/>
-        </w:rPr>
-        <w:t>hours</w:t>
-      </w:r>
-      <w:r>
-        <w:rPr>
-          <w:spacing w:val="33"/>
-        </w:rPr>
-        <w:t xml:space="preserve"> </w:t>
-      </w:r>
-      <w:r>
-        <w:t>of</w:t>
-      </w:r>
-      <w:r>
-        <w:rPr>
-          <w:spacing w:val="34"/>
-        </w:rPr>
-        <w:t xml:space="preserve"> </w:t>
-      </w:r>
-      <w:r>
-        <w:t xml:space="preserve">manual </w:t>
-      </w:r>
-      <w:r>
-        <w:t xml:space="preserve">  </w:t>
-      </w:r>
-      <w:r>
-        <w:t>financial</w:t>
-      </w:r>
-      <w:r>
-        <w:rPr>
-          <w:spacing w:val="40"/>
-        </w:rPr>
-        <w:t xml:space="preserve"> </w:t>
-      </w:r>
-      <w:r>
-        <w:t>reporting,</w:t>
-      </w:r>
-      <w:r>
-        <w:rPr>
-          <w:spacing w:val="40"/>
-        </w:rPr>
-        <w:t xml:space="preserve"> </w:t>
-      </w:r>
-      <w:r>
-        <w:rPr>
-          <w:color w:val="343434"/>
-        </w:rPr>
-        <w:t>enab</w:t>
-      </w:r>
-      <w:r>
-        <w:t>ling</w:t>
-      </w:r>
-      <w:r>
-        <w:rPr>
-          <w:spacing w:val="31"/>
-        </w:rPr>
-        <w:t xml:space="preserve"> </w:t>
-      </w:r>
-      <w:r>
-        <w:t>team</w:t>
-      </w:r>
-      <w:r>
-        <w:t>s</w:t>
-      </w:r>
-      <w:r>
-        <w:rPr>
-          <w:spacing w:val="40"/>
-        </w:rPr>
-        <w:t xml:space="preserve"> </w:t>
-      </w:r>
-      <w:r>
-        <w:t>to</w:t>
-      </w:r>
-      <w:r>
-        <w:rPr>
-          <w:spacing w:val="35"/>
-        </w:rPr>
-        <w:t xml:space="preserve"> </w:t>
-      </w:r>
-      <w:r>
-        <w:t>redirect</w:t>
-      </w:r>
-      <w:r>
-        <w:rPr>
-          <w:spacing w:val="40"/>
-        </w:rPr>
-        <w:t xml:space="preserve"> </w:t>
-      </w:r>
-      <w:r>
-        <w:rPr>
-          <w:color w:val="343434"/>
-        </w:rPr>
-        <w:t>saved</w:t>
-      </w:r>
-      <w:r>
-        <w:rPr>
-          <w:color w:val="343434"/>
-          <w:spacing w:val="40"/>
-        </w:rPr>
-        <w:t xml:space="preserve"> </w:t>
-      </w:r>
-      <w:r>
-        <w:t>time</w:t>
-      </w:r>
-      <w:r>
-        <w:rPr>
-          <w:spacing w:val="40"/>
-        </w:rPr>
-        <w:t xml:space="preserve"> </w:t>
-      </w:r>
-      <w:r>
-        <w:t>to</w:t>
-      </w:r>
-      <w:r>
-        <w:rPr>
-          <w:spacing w:val="31"/>
-        </w:rPr>
-        <w:t xml:space="preserve"> </w:t>
-      </w:r>
-      <w:r>
-        <w:t>other</w:t>
-      </w:r>
-      <w:r>
-        <w:rPr>
-          <w:spacing w:val="40"/>
-        </w:rPr>
-        <w:t xml:space="preserve"> </w:t>
-      </w:r>
-      <w:r>
-        <w:t>business</w:t>
-      </w:r>
-      <w:r>
-        <w:rPr>
-          <w:spacing w:val="40"/>
-        </w:rPr>
-        <w:t xml:space="preserve"> </w:t>
-      </w:r>
-      <w:r>
-        <w:t>operations.</w:t>
-      </w:r>
-    </w:p>
-    <w:p>
-      <w:pPr>
-        <w:pStyle w:val="ListParagraph"/>
-        <w:numPr>
-          <w:ilvl w:val="0"/>
-          <w:numId w:val="11"/>
-        </w:numPr>
-        <w:rPr>
-          <w:i/>
-          <w:sz w:val="21"/>
-        </w:rPr>
-      </w:pPr>
-      <w:r>
-        <w:t>Created</w:t>
-      </w:r>
-      <w:r>
-        <w:rPr>
-          <w:spacing w:val="32"/>
-        </w:rPr>
-        <w:t xml:space="preserve"> </w:t>
-      </w:r>
-      <w:r>
-        <w:t>Power</w:t>
-      </w:r>
-      <w:r>
-        <w:rPr>
-          <w:spacing w:val="34"/>
-        </w:rPr>
-        <w:t xml:space="preserve"> </w:t>
-      </w:r>
-      <w:r>
-        <w:t>BI</w:t>
-      </w:r>
-      <w:r>
-        <w:rPr>
-          <w:spacing w:val="19"/>
-        </w:rPr>
-        <w:t xml:space="preserve"> </w:t>
-      </w:r>
-      <w:r>
-        <w:t>dashboards,</w:t>
-      </w:r>
-      <w:r>
-        <w:rPr>
-          <w:spacing w:val="35"/>
-        </w:rPr>
-        <w:t xml:space="preserve"> </w:t>
-      </w:r>
-      <w:r>
-        <w:t>increas</w:t>
-      </w:r>
-      <w:r>
-        <w:t>ed</w:t>
-      </w:r>
-      <w:r>
-        <w:rPr>
-          <w:spacing w:val="29"/>
-        </w:rPr>
-        <w:t xml:space="preserve"> </w:t>
-      </w:r>
-      <w:r>
-        <w:rPr>
-          <w:color w:val="0A0A0A"/>
-        </w:rPr>
-        <w:t>u</w:t>
-      </w:r>
-      <w:r>
-        <w:rPr>
-          <w:color w:val="343434"/>
-        </w:rPr>
-        <w:t xml:space="preserve">sage </w:t>
-      </w:r>
-      <w:r>
-        <w:t>of dashboards</w:t>
-      </w:r>
-      <w:r>
-        <w:rPr>
-          <w:spacing w:val="35"/>
-        </w:rPr>
-        <w:t xml:space="preserve"> </w:t>
-      </w:r>
-      <w:r>
-        <w:t xml:space="preserve">for </w:t>
-      </w:r>
-      <w:r>
-        <w:rPr>
-          <w:color w:val="343434"/>
-        </w:rPr>
-        <w:t>strategic</w:t>
-      </w:r>
-      <w:r>
-        <w:rPr>
-          <w:color w:val="343434"/>
-          <w:spacing w:val="19"/>
-        </w:rPr>
-        <w:t xml:space="preserve"> </w:t>
-      </w:r>
-      <w:r>
-        <w:t>decisions</w:t>
-      </w:r>
-      <w:r>
-        <w:rPr>
-          <w:spacing w:val="27"/>
-        </w:rPr>
-        <w:t xml:space="preserve"> </w:t>
-      </w:r>
-      <w:r>
-        <w:t>by</w:t>
-      </w:r>
-      <w:r>
-        <w:rPr>
-          <w:spacing w:val="26"/>
-        </w:rPr>
-        <w:t xml:space="preserve"> </w:t>
-      </w:r>
-      <w:r>
-        <w:rPr>
-          <w:b/>
-          <w:bCs/>
-        </w:rPr>
-        <w:t>20%</w:t>
-      </w:r>
-      <w:r>
-        <w:rPr>
-          <w:spacing w:val="24"/>
-        </w:rPr>
-        <w:t xml:space="preserve"> </w:t>
-      </w:r>
-      <w:r>
-        <w:t xml:space="preserve">and </w:t>
-      </w:r>
-      <w:r>
-        <w:t xml:space="preserve">ran </w:t>
-      </w:r>
-      <w:r>
-        <w:t xml:space="preserve">weekly </w:t>
-      </w:r>
-      <w:r>
-        <w:rPr>
-          <w:color w:val="343434"/>
-        </w:rPr>
-        <w:t>training sessio</w:t>
-      </w:r>
-      <w:r>
-        <w:rPr>
-          <w:color w:val="0A0A0A"/>
-        </w:rPr>
-        <w:t>n</w:t>
-      </w:r>
-      <w:r>
-        <w:rPr>
-          <w:color w:val="343434"/>
-        </w:rPr>
-        <w:t xml:space="preserve">s </w:t>
-      </w:r>
-      <w:r>
-        <w:t xml:space="preserve">for internal </w:t>
-      </w:r>
-      <w:r>
-        <w:rPr>
-          <w:color w:val="343434"/>
-        </w:rPr>
-        <w:t>stakeho</w:t>
-      </w:r>
-      <w:r>
-        <w:rPr>
-          <w:color w:val="0A0A0A"/>
-        </w:rPr>
-        <w:t>ld</w:t>
-      </w:r>
-      <w:r>
-        <w:rPr>
-          <w:color w:val="343434"/>
-        </w:rPr>
-        <w:t>ers</w:t>
-      </w:r>
-      <w:r>
-        <w:t>.</w:t>
-      </w:r>
-    </w:p>
-    <w:p>
-      <w:pPr>
-        <w:pStyle w:val="ListParagraph"/>
-        <w:numPr>
-          <w:ilvl w:val="0"/>
-          <w:numId w:val="11"/>
-        </w:numPr>
-      </w:pPr>
-      <w:r>
-        <w:t>Optimiz</w:t>
-      </w:r>
-      <w:r>
-        <w:rPr>
-          <w:color w:val="494949"/>
-        </w:rPr>
-        <w:t>e</w:t>
-      </w:r>
-      <w:r>
-        <w:t>d</w:t>
-      </w:r>
-      <w:r>
-        <w:t xml:space="preserve"> SQL </w:t>
-      </w:r>
-      <w:r>
-        <w:t>data</w:t>
-      </w:r>
-      <w:r>
-        <w:t xml:space="preserve"> </w:t>
-      </w:r>
-      <w:r>
-        <w:t>warehouse</w:t>
-      </w:r>
-      <w:r>
-        <w:rPr>
-          <w:spacing w:val="19"/>
-        </w:rPr>
-        <w:t xml:space="preserve"> </w:t>
-      </w:r>
-      <w:r>
-        <w:t>ETL</w:t>
-      </w:r>
-      <w:r>
-        <w:rPr>
-          <w:spacing w:val="32"/>
-        </w:rPr>
-        <w:t xml:space="preserve"> </w:t>
-      </w:r>
-      <w:r>
-        <w:t>T-SQL</w:t>
-      </w:r>
-      <w:r>
-        <w:rPr>
-          <w:spacing w:val="35"/>
-        </w:rPr>
-        <w:t xml:space="preserve"> </w:t>
-      </w:r>
-      <w:r>
-        <w:rPr>
-          <w:color w:val="343434"/>
-        </w:rPr>
-        <w:t>code,</w:t>
-      </w:r>
-      <w:r>
-        <w:rPr>
-          <w:color w:val="343434"/>
-          <w:spacing w:val="37"/>
-        </w:rPr>
-        <w:t xml:space="preserve"> </w:t>
-      </w:r>
-      <w:r>
-        <w:rPr>
-          <w:color w:val="343434"/>
-        </w:rPr>
-        <w:t>cutting</w:t>
-      </w:r>
-      <w:r>
-        <w:rPr>
-          <w:color w:val="343434"/>
-          <w:spacing w:val="29"/>
-        </w:rPr>
-        <w:t xml:space="preserve"> </w:t>
-      </w:r>
-      <w:r>
-        <w:t>daily</w:t>
-      </w:r>
-      <w:r>
-        <w:rPr>
-          <w:spacing w:val="36"/>
-        </w:rPr>
-        <w:t xml:space="preserve"> </w:t>
-      </w:r>
-      <w:r>
-        <w:t>update time</w:t>
-      </w:r>
-      <w:r>
-        <w:rPr>
-          <w:spacing w:val="30"/>
-        </w:rPr>
-        <w:t xml:space="preserve"> </w:t>
-      </w:r>
-      <w:r>
-        <w:t>by</w:t>
-      </w:r>
-      <w:r>
-        <w:rPr>
-          <w:spacing w:val="24"/>
-        </w:rPr>
-        <w:t xml:space="preserve"> </w:t>
-      </w:r>
-      <w:r>
-        <w:rPr>
-          <w:b/>
-          <w:bCs/>
-          <w:spacing w:val="-4"/>
-        </w:rPr>
-        <w:t>30%</w:t>
-      </w:r>
-      <w:r>
-        <w:rPr>
-          <w:b/>
-          <w:bCs/>
-          <w:spacing w:val="-4"/>
-        </w:rPr>
-        <w:t xml:space="preserve"> </w:t>
-      </w:r>
-      <w:r>
-        <w:rPr>
-          <w:spacing w:val="-4"/>
-        </w:rPr>
-        <w:t xml:space="preserve">and ensuring up-to-date </w:t>
-      </w:r>
-      <w:r>
-        <w:rPr>
-          <w:spacing w:val="-4"/>
-        </w:rPr>
-        <w:t>tables at the start of each business day</w:t>
-      </w:r>
-      <w:r>
-        <w:rPr>
-          <w:b/>
-          <w:bCs/>
-          <w:spacing w:val="-4"/>
-        </w:rPr>
         <w:t>.</w:t>
       </w:r>
     </w:p>
@@ -2432,72 +1588,35 @@
         </w:numPr>
       </w:pPr>
       <w:r>
-        <w:t xml:space="preserve">Implemented </w:t>
-      </w:r>
-      <w:r>
-        <w:t xml:space="preserve">Generative Speech Error Correction </w:t>
-      </w:r>
-      <w:r>
-        <w:t>by fine-tuning</w:t>
-      </w:r>
-      <w:r>
-        <w:t xml:space="preserve"> Google FLAN-T5</w:t>
-      </w:r>
-      <w:r>
-        <w:t xml:space="preserve"> LLM</w:t>
-      </w:r>
-      <w:r>
-        <w:t xml:space="preserve"> to correct </w:t>
+        <w:t xml:space="preserve">Built a clinical joint-attention detection </w:t>
+      </w:r>
+      <w:r>
+        <w:t>tool</w:t>
+      </w:r>
+      <w:r>
+        <w:t xml:space="preserve"> through systematic comparison of transformer architectures (PoseC3D volumetric, STGCN graph-based, SPOTER sequence) evaluated on </w:t>
+      </w:r>
+      <w:r>
+        <w:t xml:space="preserve">a custom dataset of </w:t>
+      </w:r>
+      <w:r>
+        <w:t>~7 hours</w:t>
+      </w:r>
+      <w:r>
+        <w:t xml:space="preserve"> of video</w:t>
+      </w:r>
+      <w:r>
+        <w:t xml:space="preserve">, achieving </w:t>
       </w:r>
       <w:r>
         <w:rPr>
           <w:b/>
           <w:bCs/>
         </w:rPr>
-        <w:t>90k+ utterances</w:t>
-      </w:r>
-      <w:r>
-        <w:t xml:space="preserve"> </w:t>
-      </w:r>
-      <w:r>
-        <w:t xml:space="preserve">produced by </w:t>
-      </w:r>
-      <w:r>
-        <w:t xml:space="preserve">OpenAI </w:t>
-      </w:r>
-      <w:r>
-        <w:t>Whisper, improving</w:t>
-      </w:r>
-      <w:r>
-        <w:t xml:space="preserve"> transcription accuracy by </w:t>
-      </w:r>
-      <w:r>
-        <w:rPr>
-          <w:rStyle w:val="Strong"/>
-          <w:b w:val="0"/>
-          <w:bCs w:val="0"/>
-        </w:rPr>
-        <w:t xml:space="preserve">up to </w:t>
-      </w:r>
-      <w:r>
-        <w:rPr>
-          <w:rStyle w:val="Strong"/>
-        </w:rPr>
-        <w:t>15%</w:t>
-      </w:r>
-      <w:r>
-        <w:rPr>
-          <w:rStyle w:val="Strong"/>
-          <w:b w:val="0"/>
-          <w:bCs w:val="0"/>
-        </w:rPr>
-        <w:t xml:space="preserve"> </w:t>
-      </w:r>
-      <w:r>
-        <w:t>on child speech</w:t>
-      </w:r>
-      <w:r>
-        <w:t>.</w:t>
+        <w:t>80%</w:t>
+      </w:r>
+      <w:r>
+        <w:t xml:space="preserve"> accuracy.</w:t>
       </w:r>
     </w:p>
     <w:p>
@@ -2509,49 +1628,27 @@
         </w:numPr>
       </w:pPr>
       <w:r>
-        <w:t xml:space="preserve">Wrote </w:t>
+        <w:t xml:space="preserve">Fine-tuned FLAN-T5 models on </w:t>
       </w:r>
       <w:r>
         <w:rPr>
           <w:b/>
           <w:bCs/>
         </w:rPr>
-        <w:t>10+</w:t>
-      </w:r>
-      <w:r>
-        <w:t xml:space="preserve"> SLURM jobs for machine learning training</w:t>
-      </w:r>
-      <w:r>
-        <w:t xml:space="preserve"> and inference workflows</w:t>
-      </w:r>
-      <w:r>
-        <w:t xml:space="preserve">, reducing manual execution time by </w:t>
+        <w:t>90k+</w:t>
+      </w:r>
+      <w:r>
+        <w:t xml:space="preserve"> speech utterances to improve transcription accuracy by up to </w:t>
       </w:r>
       <w:r>
         <w:rPr>
           <w:b/>
           <w:bCs/>
         </w:rPr>
-        <w:t>90</w:t>
-      </w:r>
-      <w:r>
-        <w:rPr>
-          <w:b/>
-          <w:bCs/>
-        </w:rPr>
-        <w:t>%</w:t>
-      </w:r>
-      <w:r>
-        <w:t xml:space="preserve"> and enabling scalable computation</w:t>
-      </w:r>
-      <w:r>
-        <w:t xml:space="preserve"> on High-Performance Computer</w:t>
-      </w:r>
-      <w:r>
-        <w:t>s</w:t>
-      </w:r>
-      <w:r>
-        <w:t>.</w:t>
+        <w:t>15%</w:t>
+      </w:r>
+      <w:r>
+        <w:t>, applying machine learning to large unstructured language data sets.</w:t>
       </w:r>
     </w:p>
     <w:p>
@@ -2563,6 +1660,283 @@
         </w:numPr>
       </w:pPr>
       <w:r>
+        <w:t xml:space="preserve">Wrote </w:t>
+      </w:r>
+      <w:r>
+        <w:rPr>
+          <w:b/>
+          <w:bCs/>
+        </w:rPr>
+        <w:t>10+</w:t>
+      </w:r>
+      <w:r>
+        <w:t xml:space="preserve"> SLURM jobs for machine learning training</w:t>
+      </w:r>
+      <w:r>
+        <w:t xml:space="preserve"> and inference workflows</w:t>
+      </w:r>
+      <w:r>
+        <w:t xml:space="preserve">, reducing manual execution time by </w:t>
+      </w:r>
+      <w:r>
+        <w:rPr>
+          <w:b/>
+          <w:bCs/>
+        </w:rPr>
+        <w:t>90%</w:t>
+      </w:r>
+      <w:r>
+        <w:t xml:space="preserve"> and enabling scalable computation</w:t>
+      </w:r>
+      <w:r>
+        <w:t xml:space="preserve"> on High-Performance Computers</w:t>
+      </w:r>
+      <w:r>
+        <w:t>.</w:t>
+      </w:r>
+    </w:p>
+    <w:p>
+      <w:pPr>
+        <w:pStyle w:val="ListParagraph"/>
+        <w:numPr>
+          <w:ilvl w:val="0"/>
+          <w:numId w:val="4"/>
+        </w:numPr>
+      </w:pPr>
+      <w:r>
+        <w:t>Engineered data</w:t>
+      </w:r>
+      <w:r>
+        <w:t>-engineering</w:t>
+      </w:r>
+      <w:r>
+        <w:t xml:space="preserve"> pipelines to transform raw speech annotations into </w:t>
+      </w:r>
+      <w:r>
+        <w:t xml:space="preserve">structured </w:t>
+      </w:r>
+      <w:r>
+        <w:t>datasets, supporting rigorous exploratory analysis and downstream machine learning development.</w:t>
+      </w:r>
+    </w:p>
+    <w:p>
+      <w:pPr>
+        <w:tabs>
+          <w:tab w:val="left" w:pos="8994"/>
+        </w:tabs>
+        <w:spacing w:before="45" w:line="251" w:lineRule="exact"/>
+        <w:ind w:left="248"/>
+      </w:pPr>
+      <w:r>
+        <w:rPr>
+          <w:b/>
+          <w:color w:val="0A0A0A"/>
+          <w:w w:val="110"/>
+        </w:rPr>
+        <w:t>Data</w:t>
+      </w:r>
+      <w:r>
+        <w:rPr>
+          <w:b/>
+          <w:color w:val="0A0A0A"/>
+          <w:spacing w:val="62"/>
+          <w:w w:val="110"/>
+        </w:rPr>
+        <w:t xml:space="preserve"> </w:t>
+      </w:r>
+      <w:r>
+        <w:rPr>
+          <w:b/>
+          <w:color w:val="0A0A0A"/>
+          <w:w w:val="110"/>
+        </w:rPr>
+        <w:t>Analyst</w:t>
+      </w:r>
+      <w:r>
+        <w:rPr>
+          <w:b/>
+          <w:color w:val="0A0A0A"/>
+          <w:spacing w:val="20"/>
+          <w:w w:val="110"/>
+        </w:rPr>
+        <w:t xml:space="preserve"> </w:t>
+      </w:r>
+      <w:r>
+        <w:rPr>
+          <w:b/>
+          <w:color w:val="0A0A0A"/>
+          <w:w w:val="110"/>
+        </w:rPr>
+        <w:t>Co-</w:t>
+      </w:r>
+      <w:r>
+        <w:rPr>
+          <w:b/>
+          <w:color w:val="0A0A0A"/>
+          <w:spacing w:val="-5"/>
+          <w:w w:val="110"/>
+        </w:rPr>
+        <w:t>op</w:t>
+      </w:r>
+      <w:r>
+        <w:rPr>
+          <w:b/>
+          <w:color w:val="0A0A0A"/>
+        </w:rPr>
+        <w:tab/>
+      </w:r>
+      <w:r>
+        <w:rPr>
+          <w:color w:val="1F1F1F"/>
+          <w:w w:val="105"/>
+        </w:rPr>
+        <w:t>Aug</w:t>
+      </w:r>
+      <w:r>
+        <w:rPr>
+          <w:color w:val="1F1F1F"/>
+          <w:spacing w:val="11"/>
+          <w:w w:val="105"/>
+        </w:rPr>
+        <w:t xml:space="preserve"> </w:t>
+      </w:r>
+      <w:r>
+        <w:rPr>
+          <w:color w:val="1F1F1F"/>
+          <w:w w:val="105"/>
+        </w:rPr>
+        <w:t>2025</w:t>
+      </w:r>
+      <w:r>
+        <w:rPr>
+          <w:color w:val="1F1F1F"/>
+          <w:spacing w:val="-2"/>
+          <w:w w:val="105"/>
+        </w:rPr>
+        <w:t xml:space="preserve"> </w:t>
+      </w:r>
+      <w:r>
+        <w:rPr>
+          <w:color w:val="0A0A0A"/>
+          <w:w w:val="105"/>
+        </w:rPr>
+        <w:t>–</w:t>
+      </w:r>
+      <w:r>
+        <w:rPr>
+          <w:color w:val="0A0A0A"/>
+          <w:spacing w:val="11"/>
+          <w:w w:val="105"/>
+        </w:rPr>
+        <w:t xml:space="preserve"> </w:t>
+      </w:r>
+      <w:r>
+        <w:rPr>
+          <w:color w:val="1F1F1F"/>
+          <w:spacing w:val="-2"/>
+          <w:w w:val="105"/>
+        </w:rPr>
+        <w:t>May 2026</w:t>
+      </w:r>
+    </w:p>
+    <w:p>
+      <w:pPr>
+        <w:tabs>
+          <w:tab w:val="left" w:pos="9495"/>
+        </w:tabs>
+        <w:spacing w:line="240" w:lineRule="exact"/>
+        <w:ind w:left="266"/>
+        <w:rPr>
+          <w:i/>
+          <w:color w:val="1F1F1F"/>
+          <w:spacing w:val="-5"/>
+          <w:sz w:val="21"/>
+        </w:rPr>
+      </w:pPr>
+      <w:r>
+        <w:rPr>
+          <w:i/>
+          <w:color w:val="1F1F1F"/>
+          <w:sz w:val="21"/>
+        </w:rPr>
+        <w:t>Alabama</w:t>
+      </w:r>
+      <w:r>
+        <w:rPr>
+          <w:i/>
+          <w:color w:val="1F1F1F"/>
+          <w:spacing w:val="21"/>
+          <w:sz w:val="21"/>
+        </w:rPr>
+        <w:t xml:space="preserve"> </w:t>
+      </w:r>
+      <w:r>
+        <w:rPr>
+          <w:i/>
+          <w:color w:val="1F1F1F"/>
+          <w:sz w:val="21"/>
+        </w:rPr>
+        <w:t>Credit</w:t>
+      </w:r>
+      <w:r>
+        <w:rPr>
+          <w:i/>
+          <w:color w:val="1F1F1F"/>
+          <w:spacing w:val="23"/>
+          <w:sz w:val="21"/>
+        </w:rPr>
+        <w:t xml:space="preserve"> </w:t>
+      </w:r>
+      <w:r>
+        <w:rPr>
+          <w:i/>
+          <w:color w:val="1F1F1F"/>
+          <w:spacing w:val="-2"/>
+          <w:sz w:val="21"/>
+        </w:rPr>
+        <w:t>Union</w:t>
+      </w:r>
+      <w:r>
+        <w:rPr>
+          <w:i/>
+          <w:color w:val="1F1F1F"/>
+          <w:sz w:val="21"/>
+        </w:rPr>
+        <w:tab/>
+        <w:t>Tuscaloosa,</w:t>
+      </w:r>
+      <w:r>
+        <w:rPr>
+          <w:i/>
+          <w:color w:val="1F1F1F"/>
+          <w:spacing w:val="37"/>
+          <w:sz w:val="21"/>
+        </w:rPr>
+        <w:t xml:space="preserve"> </w:t>
+      </w:r>
+      <w:r>
+        <w:rPr>
+          <w:i/>
+          <w:color w:val="1F1F1F"/>
+          <w:spacing w:val="-5"/>
+          <w:sz w:val="21"/>
+        </w:rPr>
+        <w:t>AL</w:t>
+      </w:r>
+    </w:p>
+    <w:p>
+      <w:pPr>
+        <w:pStyle w:val="ListParagraph"/>
+        <w:numPr>
+          <w:ilvl w:val="0"/>
+          <w:numId w:val="11"/>
+        </w:numPr>
+        <w:rPr>
+          <w:i/>
+          <w:sz w:val="21"/>
+        </w:rPr>
+      </w:pPr>
+      <w:r>
         <w:t>Built</w:t>
       </w:r>
       <w:r>
@@ -2572,7 +1946,199 @@
         <w:t xml:space="preserve"> </w:t>
       </w:r>
       <w:r>
-        <w:t>scalable</w:t>
+        <w:rPr>
+          <w:color w:val="343434"/>
+        </w:rPr>
+        <w:t>end</w:t>
+      </w:r>
+      <w:r>
+        <w:t>-to-</w:t>
+      </w:r>
+      <w:r>
+        <w:rPr>
+          <w:color w:val="343434"/>
+        </w:rPr>
+        <w:t>end</w:t>
+      </w:r>
+      <w:r>
+        <w:rPr>
+          <w:color w:val="343434"/>
+          <w:spacing w:val="33"/>
+        </w:rPr>
+        <w:t xml:space="preserve"> </w:t>
+      </w:r>
+      <w:r>
+        <w:rPr>
+          <w:color w:val="343434"/>
+        </w:rPr>
+        <w:t>automation</w:t>
+      </w:r>
+      <w:r>
+        <w:rPr>
+          <w:color w:val="343434"/>
+          <w:spacing w:val="27"/>
+        </w:rPr>
+        <w:t xml:space="preserve"> </w:t>
+      </w:r>
+      <w:r>
+        <w:rPr>
+          <w:color w:val="343434"/>
+        </w:rPr>
+        <w:t>so</w:t>
+      </w:r>
+      <w:r>
+        <w:t>lution</w:t>
+      </w:r>
+      <w:r>
+        <w:rPr>
+          <w:spacing w:val="40"/>
+        </w:rPr>
+        <w:t xml:space="preserve"> </w:t>
+      </w:r>
+      <w:r>
+        <w:t>using</w:t>
+      </w:r>
+      <w:r>
+        <w:rPr>
+          <w:spacing w:val="34"/>
+        </w:rPr>
+        <w:t xml:space="preserve"> </w:t>
+      </w:r>
+      <w:r>
+        <w:t>Microsoft</w:t>
+      </w:r>
+      <w:r>
+        <w:rPr>
+          <w:spacing w:val="40"/>
+        </w:rPr>
+        <w:t xml:space="preserve"> </w:t>
+      </w:r>
+      <w:r>
+        <w:t>Power</w:t>
+      </w:r>
+      <w:r>
+        <w:rPr>
+          <w:spacing w:val="40"/>
+        </w:rPr>
+        <w:t xml:space="preserve"> </w:t>
+      </w:r>
+      <w:r>
+        <w:t>Automate</w:t>
+      </w:r>
+      <w:r>
+        <w:rPr>
+          <w:spacing w:val="40"/>
+        </w:rPr>
+        <w:t xml:space="preserve"> </w:t>
+      </w:r>
+      <w:r>
+        <w:t>that</w:t>
+      </w:r>
+      <w:r>
+        <w:rPr>
+          <w:spacing w:val="34"/>
+        </w:rPr>
+        <w:t xml:space="preserve"> </w:t>
+      </w:r>
+      <w:r>
+        <w:rPr>
+          <w:b/>
+          <w:bCs/>
+          <w:color w:val="343434"/>
+        </w:rPr>
+        <w:t>e</w:t>
+      </w:r>
+      <w:r>
+        <w:rPr>
+          <w:b/>
+          <w:bCs/>
+        </w:rPr>
+        <w:t>limina</w:t>
+      </w:r>
+      <w:r>
+        <w:rPr>
+          <w:b/>
+          <w:bCs/>
+          <w:color w:val="343434"/>
+        </w:rPr>
+        <w:t>ted</w:t>
+      </w:r>
+      <w:r>
+        <w:rPr>
+          <w:color w:val="343434"/>
+          <w:spacing w:val="31"/>
+        </w:rPr>
+        <w:t xml:space="preserve"> </w:t>
+      </w:r>
+      <w:r>
+        <w:rPr>
+          <w:b/>
+          <w:bCs/>
+        </w:rPr>
+        <w:t>16 monthly hours</w:t>
+      </w:r>
+      <w:r>
+        <w:rPr>
+          <w:spacing w:val="33"/>
+        </w:rPr>
+        <w:t xml:space="preserve"> </w:t>
+      </w:r>
+      <w:r>
+        <w:t>of</w:t>
+      </w:r>
+      <w:r>
+        <w:rPr>
+          <w:spacing w:val="34"/>
+        </w:rPr>
+        <w:t xml:space="preserve"> </w:t>
+      </w:r>
+      <w:r>
+        <w:t>manual   financial</w:t>
+      </w:r>
+      <w:r>
+        <w:rPr>
+          <w:spacing w:val="40"/>
+        </w:rPr>
+        <w:t xml:space="preserve"> </w:t>
+      </w:r>
+      <w:r>
+        <w:t>reporting,</w:t>
+      </w:r>
+      <w:r>
+        <w:rPr>
+          <w:spacing w:val="40"/>
+        </w:rPr>
+        <w:t xml:space="preserve"> </w:t>
+      </w:r>
+      <w:r>
+        <w:rPr>
+          <w:color w:val="343434"/>
+        </w:rPr>
+        <w:t>enab</w:t>
+      </w:r>
+      <w:r>
+        <w:t>ling</w:t>
+      </w:r>
+      <w:r>
+        <w:rPr>
+          <w:spacing w:val="31"/>
+        </w:rPr>
+        <w:t xml:space="preserve"> </w:t>
+      </w:r>
+      <w:r>
+        <w:t>team</w:t>
+      </w:r>
+      <w:r>
+        <w:t>s</w:t>
+      </w:r>
+      <w:r>
+        <w:rPr>
+          <w:spacing w:val="40"/>
+        </w:rPr>
+        <w:t xml:space="preserve"> </w:t>
+      </w:r>
+      <w:r>
+        <w:t>to</w:t>
       </w:r>
       <w:r>
         <w:rPr>
@@ -2581,16 +2147,7 @@
         <w:t xml:space="preserve"> </w:t>
       </w:r>
       <w:r>
-        <w:t>data</w:t>
-      </w:r>
-      <w:r>
-        <w:rPr>
-          <w:spacing w:val="29"/>
-        </w:rPr>
-        <w:t>-</w:t>
-      </w:r>
-      <w:r>
-        <w:t>engineering</w:t>
+        <w:t>redirect</w:t>
       </w:r>
       <w:r>
         <w:rPr>
@@ -2599,40 +2156,10 @@
         <w:t xml:space="preserve"> </w:t>
       </w:r>
       <w:r>
-        <w:t>pipelines</w:t>
-      </w:r>
-      <w:r>
-        <w:rPr>
-          <w:spacing w:val="37"/>
-        </w:rPr>
-        <w:t xml:space="preserve"> </w:t>
-      </w:r>
-      <w:r>
-        <w:t>to</w:t>
-      </w:r>
-      <w:r>
-        <w:rPr>
-          <w:spacing w:val="40"/>
-        </w:rPr>
-        <w:t xml:space="preserve"> </w:t>
-      </w:r>
-      <w:r>
-        <w:t>parse</w:t>
-      </w:r>
-      <w:r>
-        <w:t xml:space="preserve"> </w:t>
-      </w:r>
-      <w:r>
-        <w:t>speech</w:t>
-      </w:r>
-      <w:r>
-        <w:t xml:space="preserve"> </w:t>
-      </w:r>
-      <w:r>
-        <w:t>a</w:t>
-      </w:r>
-      <w:r>
-        <w:t>nnotations</w:t>
+        <w:rPr>
+          <w:color w:val="343434"/>
+        </w:rPr>
+        <w:t>saved</w:t>
       </w:r>
       <w:r>
         <w:rPr>
@@ -2642,239 +2169,283 @@
         <w:t xml:space="preserve"> </w:t>
       </w:r>
       <w:r>
-        <w:rPr>
-          <w:color w:val="0A0A0A"/>
-        </w:rPr>
-        <w:t xml:space="preserve">into </w:t>
+        <w:t>time</w:t>
+      </w:r>
+      <w:r>
+        <w:rPr>
+          <w:spacing w:val="40"/>
+        </w:rPr>
+        <w:t xml:space="preserve"> </w:t>
+      </w:r>
+      <w:r>
+        <w:t>to</w:t>
+      </w:r>
+      <w:r>
+        <w:rPr>
+          <w:spacing w:val="31"/>
+        </w:rPr>
+        <w:t xml:space="preserve"> </w:t>
+      </w:r>
+      <w:r>
+        <w:t>other</w:t>
+      </w:r>
+      <w:r>
+        <w:rPr>
+          <w:spacing w:val="40"/>
+        </w:rPr>
+        <w:t xml:space="preserve"> </w:t>
+      </w:r>
+      <w:r>
+        <w:t>business</w:t>
+      </w:r>
+      <w:r>
+        <w:rPr>
+          <w:spacing w:val="40"/>
+        </w:rPr>
+        <w:t xml:space="preserve"> </w:t>
+      </w:r>
+      <w:r>
+        <w:t>operations.</w:t>
+      </w:r>
+    </w:p>
+    <w:p>
+      <w:pPr>
+        <w:pStyle w:val="ListParagraph"/>
+        <w:numPr>
+          <w:ilvl w:val="0"/>
+          <w:numId w:val="11"/>
+        </w:numPr>
+      </w:pPr>
+      <w:r>
+        <w:t>Created</w:t>
+      </w:r>
+      <w:r>
+        <w:rPr>
+          <w:spacing w:val="32"/>
+        </w:rPr>
+        <w:t xml:space="preserve"> </w:t>
+      </w:r>
+      <w:r>
+        <w:rPr>
+          <w:b/>
+          <w:bCs/>
+          <w:spacing w:val="32"/>
+        </w:rPr>
+        <w:t>5+</w:t>
+      </w:r>
+      <w:r>
+        <w:rPr>
+          <w:spacing w:val="32"/>
+        </w:rPr>
+        <w:t xml:space="preserve"> </w:t>
+      </w:r>
+      <w:r>
+        <w:t>Power</w:t>
+      </w:r>
+      <w:r>
+        <w:rPr>
+          <w:spacing w:val="34"/>
+        </w:rPr>
+        <w:t xml:space="preserve"> </w:t>
+      </w:r>
+      <w:r>
+        <w:t>BI</w:t>
+      </w:r>
+      <w:r>
+        <w:rPr>
+          <w:spacing w:val="19"/>
+        </w:rPr>
+        <w:t xml:space="preserve"> </w:t>
+      </w:r>
+      <w:r>
+        <w:t>dashboards,</w:t>
+      </w:r>
+      <w:r>
+        <w:rPr>
+          <w:spacing w:val="35"/>
+        </w:rPr>
+        <w:t xml:space="preserve"> </w:t>
+      </w:r>
+      <w:r>
+        <w:t>increasing</w:t>
+      </w:r>
+      <w:r>
+        <w:rPr>
+          <w:spacing w:val="29"/>
+        </w:rPr>
+        <w:t xml:space="preserve"> </w:t>
+      </w:r>
+      <w:r>
+        <w:rPr>
+          <w:color w:val="0A0A0A"/>
+        </w:rPr>
+        <w:t>u</w:t>
       </w:r>
       <w:r>
         <w:rPr>
           <w:color w:val="343434"/>
         </w:rPr>
-        <w:t>structured</w:t>
+        <w:t xml:space="preserve">sage </w:t>
+      </w:r>
+      <w:r>
+        <w:t>of</w:t>
+      </w:r>
+      <w:r>
+        <w:rPr>
+          <w:spacing w:val="25"/>
+        </w:rPr>
+        <w:t xml:space="preserve"> </w:t>
+      </w:r>
+      <w:r>
+        <w:t>dashboards</w:t>
+      </w:r>
+      <w:r>
+        <w:rPr>
+          <w:spacing w:val="35"/>
+        </w:rPr>
+        <w:t xml:space="preserve"> </w:t>
+      </w:r>
+      <w:r>
+        <w:t xml:space="preserve">for </w:t>
       </w:r>
       <w:r>
         <w:rPr>
           <w:color w:val="343434"/>
-          <w:spacing w:val="40"/>
-        </w:rPr>
-        <w:t xml:space="preserve"> </w:t>
-      </w:r>
-      <w:r>
-        <w:t xml:space="preserve">datasets; </w:t>
+        </w:rPr>
+        <w:t>strategic</w:t>
       </w:r>
       <w:r>
         <w:rPr>
           <w:color w:val="343434"/>
-        </w:rPr>
-        <w:t>conducted</w:t>
+          <w:spacing w:val="19"/>
+        </w:rPr>
+        <w:t xml:space="preserve"> </w:t>
+      </w:r>
+      <w:r>
+        <w:t>decisions</w:t>
+      </w:r>
+      <w:r>
+        <w:rPr>
+          <w:spacing w:val="27"/>
+        </w:rPr>
+        <w:t xml:space="preserve"> </w:t>
+      </w:r>
+      <w:r>
+        <w:t>by</w:t>
+      </w:r>
+      <w:r>
+        <w:rPr>
+          <w:spacing w:val="26"/>
+        </w:rPr>
+        <w:t xml:space="preserve"> </w:t>
+      </w:r>
+      <w:r>
+        <w:rPr>
+          <w:b/>
+          <w:bCs/>
+        </w:rPr>
+        <w:t>20%</w:t>
+      </w:r>
+      <w:r>
+        <w:rPr>
+          <w:spacing w:val="24"/>
+        </w:rPr>
+        <w:t xml:space="preserve"> </w:t>
+      </w:r>
+      <w:r>
+        <w:t>and</w:t>
+      </w:r>
+      <w:r>
+        <w:rPr>
+          <w:spacing w:val="25"/>
+        </w:rPr>
+        <w:t xml:space="preserve"> </w:t>
+      </w:r>
+      <w:r>
+        <w:t>ran weekly</w:t>
+      </w:r>
+      <w:r>
+        <w:rPr>
+          <w:spacing w:val="27"/>
+        </w:rPr>
+        <w:t xml:space="preserve"> </w:t>
       </w:r>
       <w:r>
         <w:rPr>
           <w:color w:val="343434"/>
-          <w:spacing w:val="40"/>
-        </w:rPr>
-        <w:t xml:space="preserve"> </w:t>
+        </w:rPr>
+        <w:t>training sessio</w:t>
+      </w:r>
+      <w:r>
+        <w:rPr>
+          <w:color w:val="0A0A0A"/>
+        </w:rPr>
+        <w:t>n</w:t>
       </w:r>
       <w:r>
         <w:rPr>
           <w:color w:val="343434"/>
         </w:rPr>
-        <w:t>exp</w:t>
-      </w:r>
-      <w:r>
-        <w:rPr>
-          <w:color w:val="0A0A0A"/>
-        </w:rPr>
-        <w:t>lorator</w:t>
+        <w:t xml:space="preserve">s </w:t>
+      </w:r>
+      <w:r>
+        <w:t xml:space="preserve">for internal </w:t>
       </w:r>
       <w:r>
         <w:rPr>
           <w:color w:val="343434"/>
         </w:rPr>
-        <w:t>y</w:t>
+        <w:t>stakeho</w:t>
+      </w:r>
+      <w:r>
+        <w:rPr>
+          <w:color w:val="0A0A0A"/>
+        </w:rPr>
+        <w:t>ld</w:t>
       </w:r>
       <w:r>
         <w:rPr>
           <w:color w:val="343434"/>
-          <w:spacing w:val="40"/>
-        </w:rPr>
-        <w:t xml:space="preserve"> </w:t>
-      </w:r>
-      <w:r>
-        <w:t>data</w:t>
-      </w:r>
-      <w:r>
-        <w:rPr>
-          <w:spacing w:val="40"/>
-        </w:rPr>
-        <w:t xml:space="preserve"> </w:t>
-      </w:r>
-      <w:r>
-        <w:rPr>
-          <w:color w:val="343434"/>
-        </w:rPr>
-        <w:t>ana</w:t>
-      </w:r>
-      <w:r>
-        <w:rPr>
-          <w:color w:val="0A0A0A"/>
-        </w:rPr>
-        <w:t>l</w:t>
-      </w:r>
-      <w:r>
-        <w:rPr>
-          <w:color w:val="343434"/>
-        </w:rPr>
-        <w:t>ys</w:t>
-      </w:r>
-      <w:r>
-        <w:rPr>
-          <w:color w:val="0A0A0A"/>
-        </w:rPr>
-        <w:t>i</w:t>
-      </w:r>
-      <w:r>
-        <w:rPr>
-          <w:color w:val="343434"/>
-        </w:rPr>
-        <w:t>s</w:t>
-      </w:r>
-      <w:r>
-        <w:rPr>
-          <w:color w:val="343434"/>
-          <w:spacing w:val="40"/>
-        </w:rPr>
-        <w:t xml:space="preserve"> </w:t>
-      </w:r>
-      <w:r>
-        <w:rPr>
-          <w:color w:val="343434"/>
-        </w:rPr>
-        <w:t xml:space="preserve">with </w:t>
-      </w:r>
-      <w:r>
-        <w:rPr>
-          <w:color w:val="343434"/>
-        </w:rPr>
-        <w:t>P</w:t>
-      </w:r>
-      <w:r>
-        <w:rPr>
-          <w:color w:val="343434"/>
-        </w:rPr>
-        <w:t>andas a</w:t>
-      </w:r>
-      <w:r>
-        <w:rPr>
-          <w:color w:val="343434"/>
-        </w:rPr>
-        <w:t>nd</w:t>
-      </w:r>
-      <w:r>
-        <w:rPr>
-          <w:color w:val="343434"/>
-          <w:spacing w:val="40"/>
-        </w:rPr>
-        <w:t xml:space="preserve"> </w:t>
-      </w:r>
-      <w:r>
-        <w:t>data</w:t>
-      </w:r>
-      <w:r>
-        <w:rPr>
-          <w:spacing w:val="40"/>
-        </w:rPr>
-        <w:t xml:space="preserve"> </w:t>
-      </w:r>
-      <w:r>
-        <w:rPr>
-          <w:color w:val="343434"/>
-        </w:rPr>
-        <w:t>visua</w:t>
-      </w:r>
-      <w:r>
-        <w:rPr>
-          <w:color w:val="0A0A0A"/>
-        </w:rPr>
-        <w:t>li</w:t>
-      </w:r>
-      <w:r>
-        <w:rPr>
-          <w:color w:val="343434"/>
-        </w:rPr>
-        <w:t>zat</w:t>
-      </w:r>
-      <w:r>
-        <w:rPr>
-          <w:color w:val="0A0A0A"/>
-        </w:rPr>
-        <w:t>ion</w:t>
-      </w:r>
-      <w:r>
-        <w:rPr>
-          <w:color w:val="343434"/>
-        </w:rPr>
-        <w:t>s</w:t>
-      </w:r>
-      <w:r>
-        <w:rPr>
-          <w:color w:val="343434"/>
-          <w:spacing w:val="39"/>
-        </w:rPr>
-        <w:t xml:space="preserve"> </w:t>
-      </w:r>
-      <w:r>
-        <w:t xml:space="preserve">using </w:t>
-      </w:r>
-      <w:r>
-        <w:t>M</w:t>
-      </w:r>
-      <w:r>
-        <w:t>atplotlib</w:t>
-      </w:r>
-      <w:r>
-        <w:rPr>
-          <w:spacing w:val="40"/>
-        </w:rPr>
-        <w:t xml:space="preserve"> </w:t>
-      </w:r>
-      <w:r>
-        <w:t>to</w:t>
-      </w:r>
-      <w:r>
-        <w:rPr>
-          <w:spacing w:val="40"/>
-        </w:rPr>
-        <w:t xml:space="preserve"> </w:t>
-      </w:r>
-      <w:r>
-        <w:rPr>
-          <w:color w:val="0A0A0A"/>
-        </w:rPr>
-        <w:t>un</w:t>
-      </w:r>
-      <w:r>
-        <w:rPr>
-          <w:color w:val="343434"/>
-        </w:rPr>
-        <w:t>cover</w:t>
-      </w:r>
-      <w:r>
-        <w:rPr>
-          <w:color w:val="343434"/>
-          <w:spacing w:val="40"/>
-        </w:rPr>
-        <w:t xml:space="preserve"> </w:t>
-      </w:r>
-      <w:r>
-        <w:t>patterns</w:t>
-      </w:r>
-      <w:r>
-        <w:rPr>
-          <w:color w:val="0A0A0A"/>
-        </w:rPr>
+        </w:rPr>
+        <w:t>ers</w:t>
+      </w:r>
+      <w:r>
         <w:t>.</w:t>
+      </w:r>
+    </w:p>
+    <w:p>
+      <w:pPr>
+        <w:pStyle w:val="ListParagraph"/>
+        <w:numPr>
+          <w:ilvl w:val="0"/>
+          <w:numId w:val="11"/>
+        </w:numPr>
+      </w:pPr>
+      <w:r>
+        <w:t xml:space="preserve">Optimized ETL processes in T-SQL, reducing daily warehouse refresh time by </w:t>
+      </w:r>
+      <w:r>
+        <w:rPr>
+          <w:b/>
+          <w:bCs/>
+        </w:rPr>
+        <w:t>30%</w:t>
+      </w:r>
+      <w:r>
+        <w:t xml:space="preserve"> and improving downstream data availability for analysis</w:t>
+      </w:r>
+      <w:r>
+        <w:t xml:space="preserve"> for </w:t>
+      </w:r>
+      <w:r>
+        <w:rPr>
+          <w:b/>
+          <w:bCs/>
+        </w:rPr>
+        <w:t>8+</w:t>
+      </w:r>
+      <w:r>
+        <w:t xml:space="preserve"> internal dashboards.</w:t>
       </w:r>
     </w:p>
     <w:p>
@@ -2953,7 +2524,7 @@
           </mc:Choice>
           <mc:Fallback>
             <w:pict>
-              <v:shape w14:anchorId="58B1DA4C" id="Graphic 6" o:spid="_x0000_s1026" style="position:absolute;margin-left:42.05pt;margin-top:14.65pt;width:529.85pt;height:.1pt;z-index:-15726592;visibility:visible;mso-wrap-style:square;mso-wrap-distance-left:0;mso-wrap-distance-top:0;mso-wrap-distance-right:0;mso-wrap-distance-bottom:0;mso-position-horizontal:absolute;mso-position-horizontal-relative:page;mso-position-vertical:absolute;mso-position-vertical-relative:text;v-text-anchor:top" coordsize="6729095,1270" o:gfxdata="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" path="m,l6728650,e" filled="f" strokeweight=".25453mm">
+              <v:shape w14:anchorId="37E4B27F" id="Graphic 6" o:spid="_x0000_s1026" style="position:absolute;margin-left:42.05pt;margin-top:14.65pt;width:529.85pt;height:.1pt;z-index:-15726592;visibility:visible;mso-wrap-style:square;mso-wrap-distance-left:0;mso-wrap-distance-top:0;mso-wrap-distance-right:0;mso-wrap-distance-bottom:0;mso-position-horizontal:absolute;mso-position-horizontal-relative:page;mso-position-vertical:absolute;mso-position-vertical-relative:text;v-text-anchor:top" coordsize="6729095,1270" o:gfxdata="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" path="m,l6728650,e" filled="f" strokeweight=".25453mm">
                 <v:path arrowok="t"/>
                 <w10:wrap type="topAndBottom" anchorx="page"/>
               </v:shape>
@@ -3129,7 +2700,6 @@
         <w:t xml:space="preserve">| </w:t>
       </w:r>
       <w:hyperlink r:id="rId8" w:history="1">
-        <w:proofErr w:type="spellStart"/>
         <w:r>
           <w:rPr>
             <w:rStyle w:val="Hyperlink"/>
@@ -3137,7 +2707,6 @@
           </w:rPr>
           <w:t>Github</w:t>
         </w:r>
-        <w:proofErr w:type="spellEnd"/>
       </w:hyperlink>
     </w:p>
     <w:p>
@@ -3185,7 +2754,6 @@
         </w:rPr>
         <w:t xml:space="preserve"> | </w:t>
       </w:r>
-      <w:proofErr w:type="spellStart"/>
       <w:r>
         <w:rPr>
           <w:rStyle w:val="ProjectSkillsChar"/>
@@ -3194,31 +2762,19 @@
           <w:i/>
           <w:iCs/>
         </w:rPr>
-        <w:t>Streamlit</w:t>
-      </w:r>
-      <w:proofErr w:type="spellEnd"/>
-      <w:r>
-        <w:rPr>
-          <w:rStyle w:val="ProjectSkillsChar"/>
-          <w:b w:val="0"/>
-          <w:bCs w:val="0"/>
+        <w:t>Streamlit, Python, Scikit-learn, OpenAI, Plotly, Pandas</w:t>
+      </w:r>
+      <w:r>
+        <w:rPr>
           <w:i/>
           <w:iCs/>
         </w:rPr>
-        <w:t>, Python, Scikit-learn, OpenAI, Plotly, Pandas</w:t>
-      </w:r>
-      <w:r>
-        <w:rPr>
-          <w:i/>
-          <w:iCs/>
-        </w:rPr>
         <w:t xml:space="preserve"> </w:t>
       </w:r>
       <w:r>
         <w:t xml:space="preserve">| </w:t>
       </w:r>
       <w:hyperlink r:id="rId9" w:history="1">
-        <w:proofErr w:type="spellStart"/>
         <w:r>
           <w:rPr>
             <w:rStyle w:val="Hyperlink"/>
@@ -3227,7 +2783,6 @@
           </w:rPr>
           <w:t>Github</w:t>
         </w:r>
-        <w:proofErr w:type="spellEnd"/>
       </w:hyperlink>
     </w:p>
     <w:p>
@@ -3235,15 +2790,7 @@
         <w:pStyle w:val="ListParagraph"/>
       </w:pPr>
       <w:r>
-        <w:t xml:space="preserve">Architected a scalable enterprise analytics platform utilizing Python and </w:t>
-      </w:r>
-      <w:proofErr w:type="spellStart"/>
-      <w:r>
-        <w:t>Streamlit</w:t>
-      </w:r>
-      <w:proofErr w:type="spellEnd"/>
-      <w:r>
-        <w:t xml:space="preserve"> to centralize </w:t>
+        <w:t xml:space="preserve">Architected a scalable enterprise analytics platform utilizing Python and Streamlit to centralize </w:t>
       </w:r>
       <w:r>
         <w:t>network infrastructure</w:t>
@@ -3430,7 +2977,7 @@
           </mc:Choice>
           <mc:Fallback>
             <w:pict>
-              <v:shape w14:anchorId="5A72E1DE" id="Graphic 8" o:spid="_x0000_s1026" style="position:absolute;margin-left:42.05pt;margin-top:14.4pt;width:529.85pt;height:.1pt;z-index:-15726080;visibility:visible;mso-wrap-style:square;mso-wrap-distance-left:0;mso-wrap-distance-top:0;mso-wrap-distance-right:0;mso-wrap-distance-bottom:0;mso-position-horizontal:absolute;mso-position-horizontal-relative:page;mso-position-vertical:absolute;mso-position-vertical-relative:text;v-text-anchor:top" coordsize="6729095,1270" o:gfxdata="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" path="m,l6728650,e" filled="f" strokeweight=".25453mm">
+              <v:shape w14:anchorId="132923CB" id="Graphic 8" o:spid="_x0000_s1026" style="position:absolute;margin-left:42.05pt;margin-top:14.4pt;width:529.85pt;height:.1pt;z-index:-15726080;visibility:visible;mso-wrap-style:square;mso-wrap-distance-left:0;mso-wrap-distance-top:0;mso-wrap-distance-right:0;mso-wrap-distance-bottom:0;mso-position-horizontal:absolute;mso-position-horizontal-relative:page;mso-position-vertical:absolute;mso-position-vertical-relative:text;v-text-anchor:top" coordsize="6729095,1270" o:gfxdata="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" path="m,l6728650,e" filled="f" strokeweight=".25453mm">
                 <v:path arrowok="t"/>
                 <w10:wrap type="topAndBottom" anchorx="page"/>
               </v:shape>
@@ -4016,51 +3563,40 @@
         </w:rPr>
         <w:t xml:space="preserve"> </w:t>
       </w:r>
-      <w:proofErr w:type="spellStart"/>
       <w:r>
         <w:rPr>
           <w:color w:val="1F1F1F"/>
           <w:w w:val="105"/>
           <w:sz w:val="20"/>
         </w:rPr>
-        <w:t>PyTorch</w:t>
-      </w:r>
-      <w:proofErr w:type="spellEnd"/>
-      <w:r>
-        <w:rPr>
-          <w:color w:val="1F1F1F"/>
+        <w:t>PyTorch,</w:t>
+      </w:r>
+      <w:r>
+        <w:rPr>
+          <w:color w:val="1F1F1F"/>
+          <w:spacing w:val="25"/>
           <w:w w:val="105"/>
           <w:sz w:val="20"/>
         </w:rPr>
-        <w:t>,</w:t>
-      </w:r>
-      <w:r>
-        <w:rPr>
-          <w:color w:val="1F1F1F"/>
-          <w:spacing w:val="25"/>
+        <w:t xml:space="preserve"> </w:t>
+      </w:r>
+      <w:r>
+        <w:rPr>
+          <w:color w:val="1F1F1F"/>
           <w:w w:val="105"/>
           <w:sz w:val="20"/>
         </w:rPr>
-        <w:t xml:space="preserve"> </w:t>
-      </w:r>
-      <w:r>
-        <w:rPr>
-          <w:color w:val="1F1F1F"/>
+        <w:t>Scikit-learn,</w:t>
+      </w:r>
+      <w:r>
+        <w:rPr>
+          <w:color w:val="1F1F1F"/>
+          <w:spacing w:val="40"/>
           <w:w w:val="105"/>
           <w:sz w:val="20"/>
         </w:rPr>
-        <w:t>Scikit-learn,</w:t>
-      </w:r>
-      <w:r>
-        <w:rPr>
-          <w:color w:val="1F1F1F"/>
-          <w:spacing w:val="40"/>
-          <w:w w:val="105"/>
-          <w:sz w:val="20"/>
-        </w:rPr>
-        <w:t xml:space="preserve"> </w:t>
-      </w:r>
-      <w:proofErr w:type="spellStart"/>
+        <w:t xml:space="preserve"> </w:t>
+      </w:r>
       <w:r>
         <w:rPr>
           <w:color w:val="343434"/>
@@ -4070,7 +3606,6 @@
         </w:rPr>
         <w:t>Numpy</w:t>
       </w:r>
-      <w:proofErr w:type="spellEnd"/>
     </w:p>
     <w:sectPr>
       <w:type w:val="continuous"/>
@@ -5899,7 +5434,6 @@
   <w:style w:type="character" w:default="1" w:styleId="DefaultParagraphFont">
     <w:name w:val="Default Paragraph Font"/>
     <w:uiPriority w:val="1"/>
-    <w:semiHidden/>
     <w:unhideWhenUsed/>
   </w:style>
   <w:style w:type="table" w:default="1" w:styleId="TableNormal">

</xml_diff>